<commit_message>
Check the structure and the context
</commit_message>
<xml_diff>
--- a/2026362_CA1_Strategic Thinking.docx
+++ b/2026362_CA1_Strategic Thinking.docx
@@ -691,7 +691,38 @@
                 <w:sz w:val="24"/>
                 <w:szCs w:val="24"/>
               </w:rPr>
-              <w:t>24.20.2026</w:t>
+              <w:t>2</w:t>
+            </w:r>
+            <w:ins w:id="1" w:author="Microsoft Office User" w:date="2026-10-22T10:31:00Z">
+              <w:r>
+                <w:rPr>
+                  <w:rFonts w:ascii="Arial" w:hAnsi="Arial" w:cs="Arial"/>
+                  <w:color w:val="000000" w:themeColor="text1"/>
+                  <w:sz w:val="24"/>
+                  <w:szCs w:val="24"/>
+                </w:rPr>
+                <w:t>3</w:t>
+              </w:r>
+            </w:ins>
+            <w:del w:id="2" w:author="Microsoft Office User" w:date="2026-10-22T10:31:00Z">
+              <w:r>
+                <w:rPr>
+                  <w:rFonts w:ascii="Arial" w:hAnsi="Arial" w:cs="Arial"/>
+                  <w:color w:val="000000" w:themeColor="text1"/>
+                  <w:sz w:val="24"/>
+                  <w:szCs w:val="24"/>
+                </w:rPr>
+                <w:delText>4</w:delText>
+              </w:r>
+            </w:del>
+            <w:r>
+              <w:rPr>
+                <w:rFonts w:ascii="Arial" w:hAnsi="Arial" w:cs="Arial"/>
+                <w:color w:val="000000" w:themeColor="text1"/>
+                <w:sz w:val="24"/>
+                <w:szCs w:val="24"/>
+              </w:rPr>
+              <w:t>.20.2026</w:t>
             </w:r>
           </w:p>
         </w:tc>
@@ -780,7 +811,7 @@
         </w:rPr>
         <w:t xml:space="preserve">I acknowledge </w:t>
       </w:r>
-      <w:ins w:id="1" w:author="Microsoft Office User" w:date="2026-10-20T09:24:00Z">
+      <w:ins w:id="3" w:author="Microsoft Office User" w:date="2026-10-20T09:24:00Z">
         <w:r>
           <w:rPr>
             <w:rFonts w:ascii="Arial" w:hAnsi="Arial" w:cs="Arial"/>
@@ -791,7 +822,7 @@
           <w:t xml:space="preserve">using </w:t>
         </w:r>
       </w:ins>
-      <w:del w:id="2" w:author="Microsoft Office User" w:date="2026-10-20T09:24:00Z">
+      <w:del w:id="4" w:author="Microsoft Office User" w:date="2026-10-20T09:24:00Z">
         <w:r>
           <w:rPr>
             <w:rFonts w:ascii="Arial" w:hAnsi="Arial" w:cs="Arial"/>
@@ -811,7 +842,7 @@
         </w:rPr>
         <w:t xml:space="preserve">Grammarly </w:t>
       </w:r>
-      <w:del w:id="3" w:author="Microsoft Office User" w:date="2026-10-20T09:24:00Z">
+      <w:del w:id="5" w:author="Microsoft Office User" w:date="2026-10-20T09:24:00Z">
         <w:r>
           <w:rPr>
             <w:rFonts w:ascii="Arial" w:hAnsi="Arial" w:cs="Arial"/>
@@ -822,7 +853,7 @@
           <w:delText xml:space="preserve">for the purpose of </w:delText>
         </w:r>
       </w:del>
-      <w:ins w:id="4" w:author="Microsoft Office User" w:date="2026-10-20T09:24:00Z">
+      <w:ins w:id="6" w:author="Microsoft Office User" w:date="2026-10-20T09:24:00Z">
         <w:r>
           <w:rPr>
             <w:rFonts w:ascii="Arial" w:hAnsi="Arial" w:cs="Arial"/>
@@ -842,7 +873,7 @@
         </w:rPr>
         <w:t>check</w:t>
       </w:r>
-      <w:del w:id="5" w:author="Microsoft Office User" w:date="2026-10-20T09:24:00Z">
+      <w:del w:id="7" w:author="Microsoft Office User" w:date="2026-10-20T09:24:00Z">
         <w:r>
           <w:rPr>
             <w:rFonts w:ascii="Arial" w:hAnsi="Arial" w:cs="Arial"/>
@@ -862,7 +893,7 @@
         </w:rPr>
         <w:t xml:space="preserve"> my </w:t>
       </w:r>
-      <w:del w:id="6" w:author="Microsoft Office User" w:date="2026-10-20T09:24:00Z">
+      <w:del w:id="8" w:author="Microsoft Office User" w:date="2026-10-20T09:24:00Z">
         <w:r>
           <w:rPr>
             <w:rFonts w:ascii="Arial" w:hAnsi="Arial" w:cs="Arial"/>
@@ -873,7 +904,7 @@
           <w:delText xml:space="preserve">grammar </w:delText>
         </w:r>
       </w:del>
-      <w:ins w:id="7" w:author="Microsoft Office User" w:date="2026-10-20T09:24:00Z">
+      <w:ins w:id="9" w:author="Microsoft Office User" w:date="2026-10-20T09:24:00Z">
         <w:r>
           <w:rPr>
             <w:rFonts w:ascii="Arial" w:hAnsi="Arial" w:cs="Arial"/>
@@ -893,7 +924,7 @@
           <w:t xml:space="preserve"> </w:t>
         </w:r>
       </w:ins>
-      <w:del w:id="8" w:author="Microsoft Office User" w:date="2026-10-20T09:24:00Z">
+      <w:del w:id="10" w:author="Microsoft Office User" w:date="2026-10-20T09:24:00Z">
         <w:r>
           <w:rPr>
             <w:rFonts w:ascii="Arial" w:hAnsi="Arial" w:cs="Arial"/>
@@ -904,7 +935,7 @@
           <w:delText>on the</w:delText>
         </w:r>
       </w:del>
-      <w:ins w:id="9" w:author="Microsoft Office User" w:date="2026-10-20T09:24:00Z">
+      <w:ins w:id="11" w:author="Microsoft Office User" w:date="2026-10-20T09:24:00Z">
         <w:r>
           <w:rPr>
             <w:rFonts w:ascii="Arial" w:hAnsi="Arial" w:cs="Arial"/>
@@ -1274,7 +1305,7 @@
         <w:spacing w:before="240" w:line="360" w:lineRule="auto"/>
         <w:jc w:val="both"/>
         <w:rPr>
-          <w:ins w:id="10" w:author="Microsoft Office User" w:date="2026-10-15T11:17:00Z"/>
+          <w:ins w:id="12" w:author="Microsoft Office User" w:date="2026-10-15T11:17:00Z"/>
           <w:rFonts w:ascii="Arial" w:eastAsia="Play" w:hAnsi="Arial" w:cs="Arial"/>
           <w:b/>
           <w:bCs/>
@@ -3056,30 +3087,6 @@
         <w:spacing w:line="360" w:lineRule="auto"/>
         <w:jc w:val="both"/>
         <w:rPr>
-          <w:ins w:id="11" w:author="Microsoft Office User" w:date="2026-10-15T11:17:00Z"/>
-          <w:rFonts w:ascii="Arial" w:hAnsi="Arial" w:cs="Arial"/>
-          <w:sz w:val="24"/>
-          <w:szCs w:val="24"/>
-        </w:rPr>
-      </w:pPr>
-    </w:p>
-    <w:p>
-      <w:pPr>
-        <w:spacing w:line="360" w:lineRule="auto"/>
-        <w:jc w:val="both"/>
-        <w:rPr>
-          <w:ins w:id="12" w:author="Microsoft Office User" w:date="2026-10-15T11:17:00Z"/>
-          <w:rFonts w:ascii="Arial" w:hAnsi="Arial" w:cs="Arial"/>
-          <w:sz w:val="24"/>
-          <w:szCs w:val="24"/>
-        </w:rPr>
-      </w:pPr>
-    </w:p>
-    <w:p>
-      <w:pPr>
-        <w:spacing w:line="360" w:lineRule="auto"/>
-        <w:jc w:val="both"/>
-        <w:rPr>
           <w:ins w:id="13" w:author="Microsoft Office User" w:date="2026-10-15T11:17:00Z"/>
           <w:rFonts w:ascii="Arial" w:hAnsi="Arial" w:cs="Arial"/>
           <w:sz w:val="24"/>
@@ -3092,7 +3099,31 @@
         <w:spacing w:line="360" w:lineRule="auto"/>
         <w:jc w:val="both"/>
         <w:rPr>
-          <w:del w:id="14" w:author="Microsoft Office User" w:date="2026-10-15T11:17:00Z"/>
+          <w:ins w:id="14" w:author="Microsoft Office User" w:date="2026-10-15T11:17:00Z"/>
+          <w:rFonts w:ascii="Arial" w:hAnsi="Arial" w:cs="Arial"/>
+          <w:sz w:val="24"/>
+          <w:szCs w:val="24"/>
+        </w:rPr>
+      </w:pPr>
+    </w:p>
+    <w:p>
+      <w:pPr>
+        <w:spacing w:line="360" w:lineRule="auto"/>
+        <w:jc w:val="both"/>
+        <w:rPr>
+          <w:ins w:id="15" w:author="Microsoft Office User" w:date="2026-10-15T11:17:00Z"/>
+          <w:rFonts w:ascii="Arial" w:hAnsi="Arial" w:cs="Arial"/>
+          <w:sz w:val="24"/>
+          <w:szCs w:val="24"/>
+        </w:rPr>
+      </w:pPr>
+    </w:p>
+    <w:p>
+      <w:pPr>
+        <w:spacing w:line="360" w:lineRule="auto"/>
+        <w:jc w:val="both"/>
+        <w:rPr>
+          <w:del w:id="16" w:author="Microsoft Office User" w:date="2026-10-15T11:17:00Z"/>
           <w:rFonts w:ascii="Arial" w:hAnsi="Arial" w:cs="Arial"/>
           <w:sz w:val="24"/>
           <w:szCs w:val="24"/>
@@ -3124,7 +3155,7 @@
           <w:szCs w:val="24"/>
         </w:rPr>
       </w:pPr>
-      <w:bookmarkStart w:id="15" w:name="_Toc242954849"/>
+      <w:bookmarkStart w:id="17" w:name="_Toc242954849"/>
       <w:r>
         <w:rPr>
           <w:rStyle w:val="SubtleEmphasis"/>
@@ -3137,7 +3168,7 @@
         <w:lastRenderedPageBreak/>
         <w:t>Project Title</w:t>
       </w:r>
-      <w:bookmarkEnd w:id="15"/>
+      <w:bookmarkEnd w:id="17"/>
     </w:p>
     <w:p>
       <w:pPr>
@@ -3180,7 +3211,7 @@
           <w:szCs w:val="24"/>
         </w:rPr>
       </w:pPr>
-      <w:bookmarkStart w:id="16" w:name="_Toc242954850"/>
+      <w:bookmarkStart w:id="18" w:name="_Toc242954850"/>
       <w:r>
         <w:rPr>
           <w:sz w:val="24"/>
@@ -3188,7 +3219,7 @@
         </w:rPr>
         <w:t>Introduction</w:t>
       </w:r>
-      <w:bookmarkEnd w:id="16"/>
+      <w:bookmarkEnd w:id="18"/>
     </w:p>
     <w:p>
       <w:pPr>
@@ -3210,7 +3241,7 @@
           <w:szCs w:val="24"/>
         </w:rPr>
       </w:pPr>
-      <w:bookmarkStart w:id="17" w:name="_Toc242954851"/>
+      <w:bookmarkStart w:id="19" w:name="_Toc242954851"/>
       <w:r>
         <w:rPr>
           <w:sz w:val="24"/>
@@ -3218,7 +3249,7 @@
         </w:rPr>
         <w:t>Brief Overview</w:t>
       </w:r>
-      <w:bookmarkEnd w:id="17"/>
+      <w:bookmarkEnd w:id="19"/>
     </w:p>
     <w:p>
       <w:pPr>
@@ -3330,7 +3361,7 @@
         </w:rPr>
         <w:t xml:space="preserve"> data from Eurostats, </w:t>
       </w:r>
-      <w:ins w:id="18" w:author="Microsoft Office User" w:date="2026-10-20T09:21:00Z">
+      <w:ins w:id="20" w:author="Microsoft Office User" w:date="2026-10-20T09:21:00Z">
         <w:r>
           <w:rPr>
             <w:sz w:val="24"/>
@@ -3346,7 +3377,7 @@
         </w:rPr>
         <w:t xml:space="preserve">European Central Bank and </w:t>
       </w:r>
-      <w:ins w:id="19" w:author="Microsoft Office User" w:date="2026-10-20T09:21:00Z">
+      <w:ins w:id="21" w:author="Microsoft Office User" w:date="2026-10-20T09:21:00Z">
         <w:r>
           <w:rPr>
             <w:sz w:val="24"/>
@@ -3384,7 +3415,7 @@
           <w:szCs w:val="24"/>
         </w:rPr>
       </w:pPr>
-      <w:bookmarkStart w:id="20" w:name="_Toc242954852"/>
+      <w:bookmarkStart w:id="22" w:name="_Toc242954852"/>
       <w:r>
         <w:rPr>
           <w:sz w:val="24"/>
@@ -3392,7 +3423,7 @@
         </w:rPr>
         <w:t>Business Context, Relevance and Significance</w:t>
       </w:r>
-      <w:bookmarkEnd w:id="20"/>
+      <w:bookmarkEnd w:id="22"/>
     </w:p>
     <w:p>
       <w:pPr>
@@ -3828,7 +3859,7 @@
         </w:rPr>
         <w:t>ember States</w:t>
       </w:r>
-      <w:ins w:id="21" w:author="Microsoft Office User" w:date="2026-10-20T09:21:00Z">
+      <w:ins w:id="23" w:author="Microsoft Office User" w:date="2026-10-20T09:21:00Z">
         <w:r>
           <w:rPr>
             <w:sz w:val="24"/>
@@ -3837,7 +3868,7 @@
           <w:t xml:space="preserve"> of the </w:t>
         </w:r>
       </w:ins>
-      <w:del w:id="22" w:author="Microsoft Office User" w:date="2026-10-20T09:21:00Z">
+      <w:del w:id="24" w:author="Microsoft Office User" w:date="2026-10-20T09:21:00Z">
         <w:r>
           <w:rPr>
             <w:sz w:val="24"/>
@@ -3859,29 +3890,7 @@
         <w:spacing w:line="360" w:lineRule="auto"/>
         <w:jc w:val="both"/>
         <w:rPr>
-          <w:del w:id="23" w:author="Microsoft Office User" w:date="2026-10-15T11:20:00Z"/>
-          <w:sz w:val="24"/>
-          <w:szCs w:val="24"/>
-        </w:rPr>
-      </w:pPr>
-    </w:p>
-    <w:p>
-      <w:pPr>
-        <w:spacing w:line="360" w:lineRule="auto"/>
-        <w:jc w:val="both"/>
-        <w:rPr>
-          <w:ins w:id="24" w:author="Microsoft Office User" w:date="2026-10-15T11:20:00Z"/>
-          <w:sz w:val="24"/>
-          <w:szCs w:val="24"/>
-        </w:rPr>
-      </w:pPr>
-    </w:p>
-    <w:p>
-      <w:pPr>
-        <w:spacing w:line="360" w:lineRule="auto"/>
-        <w:jc w:val="both"/>
-        <w:rPr>
-          <w:ins w:id="25" w:author="Microsoft Office User" w:date="2026-10-15T11:20:00Z"/>
+          <w:del w:id="25" w:author="Microsoft Office User" w:date="2026-10-15T11:20:00Z"/>
           <w:sz w:val="24"/>
           <w:szCs w:val="24"/>
         </w:rPr>
@@ -3925,7 +3934,29 @@
         <w:spacing w:line="360" w:lineRule="auto"/>
         <w:jc w:val="both"/>
         <w:rPr>
-          <w:del w:id="29" w:author="Microsoft Office User" w:date="2026-10-15T11:20:00Z"/>
+          <w:ins w:id="29" w:author="Microsoft Office User" w:date="2026-10-15T11:20:00Z"/>
+          <w:sz w:val="24"/>
+          <w:szCs w:val="24"/>
+        </w:rPr>
+      </w:pPr>
+    </w:p>
+    <w:p>
+      <w:pPr>
+        <w:spacing w:line="360" w:lineRule="auto"/>
+        <w:jc w:val="both"/>
+        <w:rPr>
+          <w:ins w:id="30" w:author="Microsoft Office User" w:date="2026-10-15T11:20:00Z"/>
+          <w:sz w:val="24"/>
+          <w:szCs w:val="24"/>
+        </w:rPr>
+      </w:pPr>
+    </w:p>
+    <w:p>
+      <w:pPr>
+        <w:spacing w:line="360" w:lineRule="auto"/>
+        <w:jc w:val="both"/>
+        <w:rPr>
+          <w:del w:id="31" w:author="Microsoft Office User" w:date="2026-10-15T11:20:00Z"/>
           <w:sz w:val="24"/>
           <w:szCs w:val="24"/>
         </w:rPr>
@@ -3951,7 +3982,7 @@
           <w:szCs w:val="24"/>
         </w:rPr>
       </w:pPr>
-      <w:bookmarkStart w:id="30" w:name="_Toc242954853"/>
+      <w:bookmarkStart w:id="32" w:name="_Toc242954853"/>
       <w:r>
         <w:rPr>
           <w:sz w:val="24"/>
@@ -3960,7 +3991,7 @@
         <w:lastRenderedPageBreak/>
         <w:t>Problem</w:t>
       </w:r>
-      <w:bookmarkEnd w:id="30"/>
+      <w:bookmarkEnd w:id="32"/>
     </w:p>
     <w:p>
       <w:pPr>
@@ -4002,7 +4033,7 @@
         </w:rPr>
         <w:t xml:space="preserve">Fintech and </w:t>
       </w:r>
-      <w:ins w:id="31" w:author="Microsoft Office User" w:date="2026-10-20T09:21:00Z">
+      <w:ins w:id="33" w:author="Microsoft Office User" w:date="2026-10-20T09:21:00Z">
         <w:r>
           <w:rPr>
             <w:sz w:val="24"/>
@@ -4011,7 +4042,7 @@
           <w:t>b</w:t>
         </w:r>
       </w:ins>
-      <w:del w:id="32" w:author="Microsoft Office User" w:date="2026-10-20T09:21:00Z">
+      <w:del w:id="34" w:author="Microsoft Office User" w:date="2026-10-20T09:21:00Z">
         <w:r>
           <w:rPr>
             <w:sz w:val="24"/>
@@ -4027,7 +4058,7 @@
         </w:rPr>
         <w:t>ank industr</w:t>
       </w:r>
-      <w:ins w:id="33" w:author="Microsoft Office User" w:date="2026-10-20T09:21:00Z">
+      <w:ins w:id="35" w:author="Microsoft Office User" w:date="2026-10-20T09:21:00Z">
         <w:r>
           <w:rPr>
             <w:sz w:val="24"/>
@@ -4036,7 +4067,7 @@
           <w:t>ie</w:t>
         </w:r>
       </w:ins>
-      <w:ins w:id="34" w:author="Microsoft Office User" w:date="2026-10-20T09:22:00Z">
+      <w:ins w:id="36" w:author="Microsoft Office User" w:date="2026-10-20T09:22:00Z">
         <w:r>
           <w:rPr>
             <w:sz w:val="24"/>
@@ -4045,7 +4076,7 @@
           <w:t>s</w:t>
         </w:r>
       </w:ins>
-      <w:del w:id="35" w:author="Microsoft Office User" w:date="2026-10-20T09:21:00Z">
+      <w:del w:id="37" w:author="Microsoft Office User" w:date="2026-10-20T09:21:00Z">
         <w:r>
           <w:rPr>
             <w:sz w:val="24"/>
@@ -4179,7 +4210,7 @@
           <w:szCs w:val="24"/>
         </w:rPr>
       </w:pPr>
-      <w:bookmarkStart w:id="36" w:name="_Toc242954854"/>
+      <w:bookmarkStart w:id="38" w:name="_Toc242954854"/>
       <w:r>
         <w:rPr>
           <w:sz w:val="24"/>
@@ -4187,7 +4218,7 @@
         </w:rPr>
         <w:t>Aim and Objective</w:t>
       </w:r>
-      <w:bookmarkEnd w:id="36"/>
+      <w:bookmarkEnd w:id="38"/>
     </w:p>
     <w:p>
       <w:pPr>
@@ -4209,7 +4240,7 @@
           <w:szCs w:val="24"/>
         </w:rPr>
       </w:pPr>
-      <w:bookmarkStart w:id="37" w:name="_Toc242954855"/>
+      <w:bookmarkStart w:id="39" w:name="_Toc242954855"/>
       <w:r>
         <w:rPr>
           <w:sz w:val="24"/>
@@ -4217,7 +4248,7 @@
         </w:rPr>
         <w:t>Aim</w:t>
       </w:r>
-      <w:bookmarkEnd w:id="37"/>
+      <w:bookmarkEnd w:id="39"/>
     </w:p>
     <w:p>
       <w:pPr>
@@ -4336,7 +4367,7 @@
           <w:szCs w:val="24"/>
         </w:rPr>
       </w:pPr>
-      <w:bookmarkStart w:id="38" w:name="_Toc242954856"/>
+      <w:bookmarkStart w:id="40" w:name="_Toc242954856"/>
       <w:r>
         <w:rPr>
           <w:sz w:val="24"/>
@@ -4344,7 +4375,7 @@
         </w:rPr>
         <w:t>Specific Objectives</w:t>
       </w:r>
-      <w:bookmarkEnd w:id="38"/>
+      <w:bookmarkEnd w:id="40"/>
     </w:p>
     <w:p>
       <w:pPr>
@@ -4540,7 +4571,7 @@
           <w:szCs w:val="24"/>
         </w:rPr>
       </w:pPr>
-      <w:bookmarkStart w:id="39" w:name="_Toc242954857"/>
+      <w:bookmarkStart w:id="41" w:name="_Toc242954857"/>
       <w:r>
         <w:rPr>
           <w:sz w:val="24"/>
@@ -4548,24 +4579,24 @@
         </w:rPr>
         <w:t>Business Hypothesis</w:t>
       </w:r>
-      <w:bookmarkEnd w:id="39"/>
-    </w:p>
-    <w:p>
-      <w:pPr>
-        <w:spacing w:line="360" w:lineRule="auto"/>
-        <w:jc w:val="both"/>
-        <w:rPr>
-          <w:sz w:val="24"/>
-          <w:szCs w:val="24"/>
-        </w:rPr>
-      </w:pPr>
-    </w:p>
-    <w:p>
-      <w:pPr>
-        <w:spacing w:line="360" w:lineRule="auto"/>
-        <w:jc w:val="both"/>
-        <w:rPr>
-          <w:del w:id="40" w:author="Microsoft Office User" w:date="2026-10-15T11:20:00Z"/>
+      <w:bookmarkEnd w:id="41"/>
+    </w:p>
+    <w:p>
+      <w:pPr>
+        <w:spacing w:line="360" w:lineRule="auto"/>
+        <w:jc w:val="both"/>
+        <w:rPr>
+          <w:sz w:val="24"/>
+          <w:szCs w:val="24"/>
+        </w:rPr>
+      </w:pPr>
+    </w:p>
+    <w:p>
+      <w:pPr>
+        <w:spacing w:line="360" w:lineRule="auto"/>
+        <w:jc w:val="both"/>
+        <w:rPr>
+          <w:del w:id="42" w:author="Microsoft Office User" w:date="2026-10-15T11:20:00Z"/>
           <w:sz w:val="24"/>
           <w:szCs w:val="24"/>
         </w:rPr>
@@ -4583,20 +4614,20 @@
         <w:spacing w:line="360" w:lineRule="auto"/>
         <w:jc w:val="both"/>
         <w:rPr>
-          <w:ins w:id="41" w:author="Microsoft Office User" w:date="2026-10-15T11:20:00Z"/>
-          <w:sz w:val="24"/>
-          <w:szCs w:val="24"/>
-        </w:rPr>
-      </w:pPr>
-    </w:p>
-    <w:p>
-      <w:pPr>
-        <w:spacing w:line="360" w:lineRule="auto"/>
-        <w:jc w:val="both"/>
-        <w:rPr>
-          <w:ins w:id="42" w:author="Microsoft Office User" w:date="2026-10-15T11:20:00Z"/>
-        </w:rPr>
-        <w:pPrChange w:id="43" w:author="Microsoft Office User" w:date="2026-10-15T11:20:00Z">
+          <w:ins w:id="43" w:author="Microsoft Office User" w:date="2026-10-15T11:20:00Z"/>
+          <w:sz w:val="24"/>
+          <w:szCs w:val="24"/>
+        </w:rPr>
+      </w:pPr>
+    </w:p>
+    <w:p>
+      <w:pPr>
+        <w:spacing w:line="360" w:lineRule="auto"/>
+        <w:jc w:val="both"/>
+        <w:rPr>
+          <w:ins w:id="44" w:author="Microsoft Office User" w:date="2026-10-15T11:20:00Z"/>
+        </w:rPr>
+        <w:pPrChange w:id="45" w:author="Microsoft Office User" w:date="2026-10-15T11:20:00Z">
           <w:pPr>
             <w:pStyle w:val="Heading1"/>
             <w:spacing w:line="360" w:lineRule="auto"/>
@@ -4604,7 +4635,7 @@
           </w:pPr>
         </w:pPrChange>
       </w:pPr>
-      <w:bookmarkStart w:id="44" w:name="_Toc242954858"/>
+      <w:bookmarkStart w:id="46" w:name="_Toc242954858"/>
     </w:p>
     <w:p>
       <w:pPr>
@@ -4624,7 +4655,7 @@
         <w:lastRenderedPageBreak/>
         <w:t>Scope</w:t>
       </w:r>
-      <w:bookmarkEnd w:id="44"/>
+      <w:bookmarkEnd w:id="46"/>
     </w:p>
     <w:p>
       <w:pPr>
@@ -4646,7 +4677,7 @@
           <w:szCs w:val="24"/>
         </w:rPr>
       </w:pPr>
-      <w:bookmarkStart w:id="45" w:name="_Toc242954859"/>
+      <w:bookmarkStart w:id="47" w:name="_Toc242954859"/>
       <w:r>
         <w:rPr>
           <w:sz w:val="24"/>
@@ -4654,7 +4685,7 @@
         </w:rPr>
         <w:t>In Scope</w:t>
       </w:r>
-      <w:bookmarkEnd w:id="45"/>
+      <w:bookmarkEnd w:id="47"/>
     </w:p>
     <w:p>
       <w:pPr>
@@ -4772,7 +4803,7 @@
         </w:rPr>
         <w:t xml:space="preserve">Eurostat and </w:t>
       </w:r>
-      <w:ins w:id="46" w:author="Microsoft Office User" w:date="2026-10-20T09:22:00Z">
+      <w:ins w:id="48" w:author="Microsoft Office User" w:date="2026-10-20T09:22:00Z">
         <w:r>
           <w:rPr>
             <w:sz w:val="24"/>
@@ -4917,7 +4948,7 @@
         </w:rPr>
         <w:t xml:space="preserve"> for </w:t>
       </w:r>
-      <w:ins w:id="47" w:author="Microsoft Office User" w:date="2026-10-20T09:22:00Z">
+      <w:ins w:id="49" w:author="Microsoft Office User" w:date="2026-10-20T09:22:00Z">
         <w:r>
           <w:rPr>
             <w:sz w:val="24"/>
@@ -4968,7 +4999,7 @@
           <w:szCs w:val="24"/>
         </w:rPr>
       </w:pPr>
-      <w:bookmarkStart w:id="48" w:name="_Toc242954860"/>
+      <w:bookmarkStart w:id="50" w:name="_Toc242954860"/>
       <w:r>
         <w:rPr>
           <w:sz w:val="24"/>
@@ -4976,7 +5007,7 @@
         </w:rPr>
         <w:t>Out of Scope</w:t>
       </w:r>
-      <w:bookmarkEnd w:id="48"/>
+      <w:bookmarkEnd w:id="50"/>
     </w:p>
     <w:p>
       <w:pPr>
@@ -5064,7 +5095,7 @@
           <w:szCs w:val="24"/>
         </w:rPr>
       </w:pPr>
-      <w:bookmarkStart w:id="49" w:name="_Toc242954861"/>
+      <w:bookmarkStart w:id="51" w:name="_Toc242954861"/>
       <w:r>
         <w:rPr>
           <w:sz w:val="24"/>
@@ -5072,7 +5103,7 @@
         </w:rPr>
         <w:t>Methodology</w:t>
       </w:r>
-      <w:bookmarkEnd w:id="49"/>
+      <w:bookmarkEnd w:id="51"/>
     </w:p>
     <w:p>
       <w:pPr>
@@ -5094,7 +5125,7 @@
           <w:szCs w:val="24"/>
         </w:rPr>
       </w:pPr>
-      <w:bookmarkStart w:id="50" w:name="_Toc242954862"/>
+      <w:bookmarkStart w:id="52" w:name="_Toc242954862"/>
       <w:r>
         <w:rPr>
           <w:sz w:val="24"/>
@@ -5102,7 +5133,7 @@
         </w:rPr>
         <w:t>Proposed data analytics methods</w:t>
       </w:r>
-      <w:bookmarkEnd w:id="50"/>
+      <w:bookmarkEnd w:id="52"/>
     </w:p>
     <w:p>
       <w:pPr>
@@ -5157,7 +5188,7 @@
         </w:rPr>
         <w:t xml:space="preserve">Create an analysis </w:t>
       </w:r>
-      <w:del w:id="51" w:author="Microsoft Office User" w:date="2026-10-20T09:22:00Z">
+      <w:del w:id="53" w:author="Microsoft Office User" w:date="2026-10-20T09:22:00Z">
         <w:r>
           <w:rPr>
             <w:sz w:val="24"/>
@@ -5166,7 +5197,7 @@
           <w:delText xml:space="preserve">correlative </w:delText>
         </w:r>
       </w:del>
-      <w:ins w:id="52" w:author="Microsoft Office User" w:date="2026-10-20T09:22:00Z">
+      <w:ins w:id="54" w:author="Microsoft Office User" w:date="2026-10-20T09:22:00Z">
         <w:r>
           <w:rPr>
             <w:sz w:val="24"/>
@@ -5283,7 +5314,7 @@
           <w:szCs w:val="24"/>
         </w:rPr>
       </w:pPr>
-      <w:del w:id="53" w:author="Microsoft Office User" w:date="2026-10-20T09:22:00Z">
+      <w:del w:id="55" w:author="Microsoft Office User" w:date="2026-10-20T09:22:00Z">
         <w:r>
           <w:rPr>
             <w:sz w:val="24"/>
@@ -5292,7 +5323,7 @@
           <w:delText xml:space="preserve">Classified </w:delText>
         </w:r>
       </w:del>
-      <w:ins w:id="54" w:author="Microsoft Office User" w:date="2026-10-20T09:22:00Z">
+      <w:ins w:id="56" w:author="Microsoft Office User" w:date="2026-10-20T09:22:00Z">
         <w:r>
           <w:rPr>
             <w:sz w:val="24"/>
@@ -5365,7 +5396,7 @@
           <w:szCs w:val="24"/>
         </w:rPr>
       </w:pPr>
-      <w:bookmarkStart w:id="55" w:name="_Toc242954863"/>
+      <w:bookmarkStart w:id="57" w:name="_Toc242954863"/>
       <w:r>
         <w:rPr>
           <w:sz w:val="24"/>
@@ -5373,7 +5404,7 @@
         </w:rPr>
         <w:t>Technologies and Tools</w:t>
       </w:r>
-      <w:bookmarkEnd w:id="55"/>
+      <w:bookmarkEnd w:id="57"/>
     </w:p>
     <w:p>
       <w:pPr>
@@ -5528,7 +5559,7 @@
           <w:szCs w:val="24"/>
         </w:rPr>
       </w:pPr>
-      <w:bookmarkStart w:id="56" w:name="_Toc242954864"/>
+      <w:bookmarkStart w:id="58" w:name="_Toc242954864"/>
       <w:r>
         <w:rPr>
           <w:sz w:val="24"/>
@@ -5536,7 +5567,7 @@
         </w:rPr>
         <w:t>System Architecture</w:t>
       </w:r>
-      <w:bookmarkEnd w:id="56"/>
+      <w:bookmarkEnd w:id="58"/>
     </w:p>
     <w:p>
       <w:pPr>
@@ -5697,7 +5728,7 @@
           <w:szCs w:val="24"/>
         </w:rPr>
       </w:pPr>
-      <w:bookmarkStart w:id="57" w:name="_Toc242954865"/>
+      <w:bookmarkStart w:id="59" w:name="_Toc242954865"/>
     </w:p>
     <w:p/>
     <w:p/>
@@ -5720,23 +5751,9 @@
         <w:spacing w:line="360" w:lineRule="auto"/>
         <w:jc w:val="both"/>
         <w:rPr>
-          <w:del w:id="58" w:author="Microsoft Office User" w:date="2026-10-15T11:20:00Z"/>
-          <w:sz w:val="24"/>
-          <w:szCs w:val="24"/>
-        </w:rPr>
-      </w:pPr>
-    </w:p>
-    <w:p>
-      <w:pPr>
-        <w:rPr>
-          <w:ins w:id="59" w:author="Microsoft Office User" w:date="2026-10-15T11:20:00Z"/>
-        </w:rPr>
-      </w:pPr>
-    </w:p>
-    <w:p>
-      <w:pPr>
-        <w:rPr>
-          <w:ins w:id="60" w:author="Microsoft Office User" w:date="2026-10-15T11:20:00Z"/>
+          <w:del w:id="60" w:author="Microsoft Office User" w:date="2026-10-15T11:20:00Z"/>
+          <w:sz w:val="24"/>
+          <w:szCs w:val="24"/>
         </w:rPr>
       </w:pPr>
     </w:p>
@@ -5785,14 +5802,14 @@
     <w:p>
       <w:pPr>
         <w:rPr>
-          <w:ins w:id="67" w:author="Microsoft Office User" w:date="2026-10-15T11:21:00Z"/>
-        </w:rPr>
-      </w:pPr>
-    </w:p>
-    <w:p>
-      <w:pPr>
-        <w:rPr>
-          <w:ins w:id="68" w:author="Microsoft Office User" w:date="2026-10-15T11:21:00Z"/>
+          <w:ins w:id="67" w:author="Microsoft Office User" w:date="2026-10-15T11:20:00Z"/>
+        </w:rPr>
+      </w:pPr>
+    </w:p>
+    <w:p>
+      <w:pPr>
+        <w:rPr>
+          <w:ins w:id="68" w:author="Microsoft Office User" w:date="2026-10-15T11:20:00Z"/>
         </w:rPr>
       </w:pPr>
     </w:p>
@@ -5813,21 +5830,21 @@
     <w:p>
       <w:pPr>
         <w:rPr>
-          <w:ins w:id="71" w:author="Microsoft Office User" w:date="2026-10-15T11:20:00Z"/>
-        </w:rPr>
-      </w:pPr>
-    </w:p>
-    <w:p>
-      <w:pPr>
-        <w:rPr>
-          <w:del w:id="72" w:author="Microsoft Office User" w:date="2026-10-15T11:20:00Z"/>
-        </w:rPr>
-      </w:pPr>
-    </w:p>
-    <w:p>
-      <w:pPr>
-        <w:rPr>
-          <w:del w:id="73" w:author="Microsoft Office User" w:date="2026-10-15T11:20:00Z"/>
+          <w:ins w:id="71" w:author="Microsoft Office User" w:date="2026-10-15T11:21:00Z"/>
+        </w:rPr>
+      </w:pPr>
+    </w:p>
+    <w:p>
+      <w:pPr>
+        <w:rPr>
+          <w:ins w:id="72" w:author="Microsoft Office User" w:date="2026-10-15T11:21:00Z"/>
+        </w:rPr>
+      </w:pPr>
+    </w:p>
+    <w:p>
+      <w:pPr>
+        <w:rPr>
+          <w:ins w:id="73" w:author="Microsoft Office User" w:date="2026-10-15T11:20:00Z"/>
         </w:rPr>
       </w:pPr>
     </w:p>
@@ -5840,11 +5857,25 @@
     </w:p>
     <w:p>
       <w:pPr>
+        <w:rPr>
+          <w:del w:id="75" w:author="Microsoft Office User" w:date="2026-10-15T11:20:00Z"/>
+        </w:rPr>
+      </w:pPr>
+    </w:p>
+    <w:p>
+      <w:pPr>
+        <w:rPr>
+          <w:del w:id="76" w:author="Microsoft Office User" w:date="2026-10-15T11:20:00Z"/>
+        </w:rPr>
+      </w:pPr>
+    </w:p>
+    <w:p>
+      <w:pPr>
         <w:pStyle w:val="Heading2"/>
         <w:spacing w:line="360" w:lineRule="auto"/>
         <w:jc w:val="both"/>
         <w:rPr>
-          <w:del w:id="75" w:author="Microsoft Office User" w:date="2026-10-15T11:20:00Z"/>
+          <w:del w:id="77" w:author="Microsoft Office User" w:date="2026-10-15T11:20:00Z"/>
           <w:sz w:val="24"/>
           <w:szCs w:val="24"/>
         </w:rPr>
@@ -5880,7 +5911,7 @@
         <w:lastRenderedPageBreak/>
         <w:t>High-Level Architecture Diagram</w:t>
       </w:r>
-      <w:bookmarkEnd w:id="57"/>
+      <w:bookmarkEnd w:id="59"/>
     </w:p>
     <w:p>
       <w:pPr>
@@ -6284,7 +6315,7 @@
           <w:szCs w:val="24"/>
         </w:rPr>
       </w:pPr>
-      <w:bookmarkStart w:id="76" w:name="_Toc242954866"/>
+      <w:bookmarkStart w:id="78" w:name="_Toc242954866"/>
       <w:r>
         <w:rPr>
           <w:sz w:val="24"/>
@@ -6292,7 +6323,7 @@
         </w:rPr>
         <w:t>Data Sources</w:t>
       </w:r>
-      <w:bookmarkEnd w:id="76"/>
+      <w:bookmarkEnd w:id="78"/>
     </w:p>
     <w:p>
       <w:pPr>
@@ -6390,7 +6421,7 @@
           <w:szCs w:val="24"/>
         </w:rPr>
       </w:pPr>
-      <w:bookmarkStart w:id="77" w:name="_Toc242954867"/>
+      <w:bookmarkStart w:id="79" w:name="_Toc242954867"/>
       <w:r>
         <w:rPr>
           <w:sz w:val="24"/>
@@ -6398,7 +6429,7 @@
         </w:rPr>
         <w:t>Type of Data Sources</w:t>
       </w:r>
-      <w:bookmarkEnd w:id="77"/>
+      <w:bookmarkEnd w:id="79"/>
     </w:p>
     <w:p>
       <w:pPr>
@@ -6437,7 +6468,7 @@
         <w:spacing w:line="360" w:lineRule="auto"/>
         <w:jc w:val="both"/>
         <w:rPr>
-          <w:del w:id="78" w:author="Microsoft Office User" w:date="2026-10-15T11:31:00Z"/>
+          <w:del w:id="80" w:author="Microsoft Office User" w:date="2026-10-15T11:31:00Z"/>
           <w:sz w:val="24"/>
           <w:szCs w:val="24"/>
         </w:rPr>
@@ -6449,7 +6480,7 @@
         </w:rPr>
         <w:t xml:space="preserve">Internet banking Activities </w:t>
       </w:r>
-      <w:del w:id="79" w:author="Microsoft Office User" w:date="2026-10-15T11:31:00Z">
+      <w:del w:id="81" w:author="Microsoft Office User" w:date="2026-10-15T11:31:00Z">
         <w:r>
           <w:rPr>
             <w:sz w:val="24"/>
@@ -6529,7 +6560,7 @@
         <w:spacing w:line="360" w:lineRule="auto"/>
         <w:jc w:val="both"/>
         <w:rPr>
-          <w:ins w:id="80" w:author="Microsoft Office User" w:date="2026-10-15T11:31:00Z"/>
+          <w:ins w:id="82" w:author="Microsoft Office User" w:date="2026-10-15T11:31:00Z"/>
           <w:sz w:val="24"/>
           <w:szCs w:val="24"/>
         </w:rPr>
@@ -6676,7 +6707,7 @@
         </w:rPr>
         <w:fldChar w:fldCharType="end"/>
       </w:r>
-      <w:del w:id="81" w:author="Microsoft Office User" w:date="2026-10-15T11:34:00Z">
+      <w:del w:id="83" w:author="Microsoft Office User" w:date="2026-10-15T11:34:00Z">
         <w:r>
           <w:rPr>
             <w:sz w:val="24"/>
@@ -6767,7 +6798,7 @@
         </w:rPr>
         <w:fldChar w:fldCharType="end"/>
       </w:r>
-      <w:del w:id="82" w:author="Microsoft Office User" w:date="2026-10-15T11:36:00Z">
+      <w:del w:id="84" w:author="Microsoft Office User" w:date="2026-10-15T11:36:00Z">
         <w:r>
           <w:rPr>
             <w:sz w:val="24"/>
@@ -6898,7 +6929,7 @@
         <w:rPr>
           <w:sz w:val="24"/>
           <w:szCs w:val="24"/>
-          <w:rPrChange w:id="83" w:author="Microsoft Office User" w:date="2026-10-15T11:29:00Z">
+          <w:rPrChange w:id="85" w:author="Microsoft Office User" w:date="2026-10-15T11:29:00Z">
             <w:rPr/>
           </w:rPrChange>
         </w:rPr>
@@ -6910,7 +6941,7 @@
         </w:rPr>
         <w:t>Payment Statistics (PAY)</w:t>
       </w:r>
-      <w:ins w:id="84" w:author="Microsoft Office User" w:date="2026-10-15T11:29:00Z">
+      <w:ins w:id="86" w:author="Microsoft Office User" w:date="2026-10-15T11:29:00Z">
         <w:r>
           <w:rPr>
             <w:sz w:val="24"/>
@@ -6933,7 +6964,7 @@
         </w:rPr>
         <w:instrText xml:space="preserve"> ADDIN ZOTERO_ITEM CSL_CITATION {"citationID":"oRZNrDRI","properties":{"unsorted":false,"formattedCitation":"({\\i{}Homepage | ECB Data Portal}, no date)","plainCitation":"(Homepage | ECB Data Portal, no date)","noteIndex":0},"citationItems":[{"id":18,"uris":["http://zotero.org/users/local/vU0rL5N7/items/UL3W58L9"],"itemData":{"id":18,"type":"webpage","title":"Homepage | ECB Data Portal","URL":"https://data.ecb.europa.eu/","accessed":{"date-parts":[["2026",10,15]]}}}],"schema":"https://github.com/citation-style-language/schema/raw/master/csl-citation.json"} </w:instrText>
       </w:r>
-      <w:ins w:id="85" w:author="Microsoft Office User" w:date="2026-10-15T11:29:00Z">
+      <w:ins w:id="87" w:author="Microsoft Office User" w:date="2026-10-15T11:29:00Z">
         <w:r>
           <w:rPr>
             <w:sz w:val="24"/>
@@ -7030,7 +7061,7 @@
         </w:rPr>
         <w:t>Digital Skills, Digital Infrastructure and Integration of Digital Technology (desi-data)</w:t>
       </w:r>
-      <w:ins w:id="86" w:author="Microsoft Office User" w:date="2026-10-15T11:31:00Z">
+      <w:ins w:id="88" w:author="Microsoft Office User" w:date="2026-10-15T11:31:00Z">
         <w:r>
           <w:rPr>
             <w:sz w:val="24"/>
@@ -7107,31 +7138,31 @@
         <w:spacing w:line="360" w:lineRule="auto"/>
         <w:jc w:val="both"/>
         <w:rPr>
-          <w:ins w:id="87" w:author="Microsoft Office User" w:date="2026-10-15T11:21:00Z"/>
-          <w:sz w:val="24"/>
-          <w:szCs w:val="24"/>
-        </w:rPr>
-      </w:pPr>
-      <w:bookmarkStart w:id="88" w:name="_Toc242954868"/>
-    </w:p>
-    <w:p>
-      <w:pPr>
-        <w:rPr>
           <w:ins w:id="89" w:author="Microsoft Office User" w:date="2026-10-15T11:21:00Z"/>
-        </w:rPr>
-      </w:pPr>
-    </w:p>
-    <w:p>
-      <w:pPr>
-        <w:rPr>
-          <w:rPrChange w:id="90" w:author="Microsoft Office User" w:date="2026-10-15T11:21:00Z">
+          <w:sz w:val="24"/>
+          <w:szCs w:val="24"/>
+        </w:rPr>
+      </w:pPr>
+      <w:bookmarkStart w:id="90" w:name="_Toc242954868"/>
+    </w:p>
+    <w:p>
+      <w:pPr>
+        <w:rPr>
+          <w:ins w:id="91" w:author="Microsoft Office User" w:date="2026-10-15T11:21:00Z"/>
+        </w:rPr>
+      </w:pPr>
+    </w:p>
+    <w:p>
+      <w:pPr>
+        <w:rPr>
+          <w:rPrChange w:id="92" w:author="Microsoft Office User" w:date="2026-10-15T11:21:00Z">
             <w:rPr>
               <w:sz w:val="24"/>
               <w:szCs w:val="24"/>
             </w:rPr>
           </w:rPrChange>
         </w:rPr>
-        <w:pPrChange w:id="91" w:author="Microsoft Office User" w:date="2026-10-15T11:21:00Z">
+        <w:pPrChange w:id="93" w:author="Microsoft Office User" w:date="2026-10-15T11:21:00Z">
           <w:pPr>
             <w:pStyle w:val="Heading2"/>
             <w:spacing w:line="360" w:lineRule="auto"/>
@@ -7158,7 +7189,7 @@
         </w:rPr>
         <w:t>Approx. Amount of Data Required</w:t>
       </w:r>
-      <w:bookmarkEnd w:id="88"/>
+      <w:bookmarkEnd w:id="90"/>
     </w:p>
     <w:p>
       <w:pPr>
@@ -7214,7 +7245,7 @@
         </w:rPr>
         <w:t xml:space="preserve">. Using data from </w:t>
       </w:r>
-      <w:ins w:id="92" w:author="Microsoft Office User" w:date="2026-10-20T09:22:00Z">
+      <w:ins w:id="94" w:author="Microsoft Office User" w:date="2026-10-20T09:22:00Z">
         <w:r>
           <w:rPr>
             <w:sz w:val="24"/>
@@ -7422,7 +7453,7 @@
         </w:rPr>
         <w:t xml:space="preserve"> the countries focus</w:t>
       </w:r>
-      <w:ins w:id="93" w:author="Microsoft Office User" w:date="2026-10-20T09:22:00Z">
+      <w:ins w:id="95" w:author="Microsoft Office User" w:date="2026-10-20T09:22:00Z">
         <w:r>
           <w:rPr>
             <w:sz w:val="24"/>
@@ -7438,7 +7469,7 @@
         </w:rPr>
         <w:t xml:space="preserve"> </w:t>
       </w:r>
-      <w:del w:id="94" w:author="Microsoft Office User" w:date="2026-10-20T09:22:00Z">
+      <w:del w:id="96" w:author="Microsoft Office User" w:date="2026-10-20T09:22:00Z">
         <w:r>
           <w:rPr>
             <w:sz w:val="24"/>
@@ -7447,7 +7478,7 @@
           <w:delText xml:space="preserve">in </w:delText>
         </w:r>
       </w:del>
-      <w:ins w:id="95" w:author="Microsoft Office User" w:date="2026-10-20T09:22:00Z">
+      <w:ins w:id="97" w:author="Microsoft Office User" w:date="2026-10-20T09:22:00Z">
         <w:r>
           <w:rPr>
             <w:sz w:val="24"/>
@@ -7560,7 +7591,7 @@
           <w:szCs w:val="24"/>
         </w:rPr>
       </w:pPr>
-      <w:bookmarkStart w:id="96" w:name="_Toc242954869"/>
+      <w:bookmarkStart w:id="98" w:name="_Toc242954869"/>
       <w:r>
         <w:rPr>
           <w:sz w:val="24"/>
@@ -7568,7 +7599,7 @@
         </w:rPr>
         <w:t>Expected Deliverables</w:t>
       </w:r>
-      <w:bookmarkEnd w:id="96"/>
+      <w:bookmarkEnd w:id="98"/>
     </w:p>
     <w:p>
       <w:pPr>
@@ -7731,26 +7762,12 @@
         <w:spacing w:line="360" w:lineRule="auto"/>
         <w:jc w:val="both"/>
         <w:rPr>
-          <w:ins w:id="97" w:author="Microsoft Office User" w:date="2026-10-15T11:10:00Z"/>
-          <w:sz w:val="24"/>
-          <w:szCs w:val="24"/>
-        </w:rPr>
-      </w:pPr>
-      <w:bookmarkStart w:id="98" w:name="_Toc242954870"/>
-    </w:p>
-    <w:p>
-      <w:pPr>
-        <w:rPr>
           <w:ins w:id="99" w:author="Microsoft Office User" w:date="2026-10-15T11:10:00Z"/>
-        </w:rPr>
-      </w:pPr>
-    </w:p>
-    <w:p>
-      <w:pPr>
-        <w:rPr>
-          <w:ins w:id="100" w:author="Microsoft Office User" w:date="2026-10-15T11:10:00Z"/>
-        </w:rPr>
-      </w:pPr>
+          <w:sz w:val="24"/>
+          <w:szCs w:val="24"/>
+        </w:rPr>
+      </w:pPr>
+      <w:bookmarkStart w:id="100" w:name="_Toc242954870"/>
     </w:p>
     <w:p>
       <w:pPr>
@@ -7818,14 +7835,14 @@
     <w:p>
       <w:pPr>
         <w:rPr>
-          <w:ins w:id="110" w:author="Microsoft Office User" w:date="2026-10-15T11:21:00Z"/>
-        </w:rPr>
-      </w:pPr>
-    </w:p>
-    <w:p>
-      <w:pPr>
-        <w:rPr>
-          <w:ins w:id="111" w:author="Microsoft Office User" w:date="2026-10-15T11:21:00Z"/>
+          <w:ins w:id="110" w:author="Microsoft Office User" w:date="2026-10-15T11:10:00Z"/>
+        </w:rPr>
+      </w:pPr>
+    </w:p>
+    <w:p>
+      <w:pPr>
+        <w:rPr>
+          <w:ins w:id="111" w:author="Microsoft Office User" w:date="2026-10-15T11:10:00Z"/>
         </w:rPr>
       </w:pPr>
     </w:p>
@@ -7846,23 +7863,37 @@
     <w:p>
       <w:pPr>
         <w:rPr>
-          <w:ins w:id="114" w:author="Microsoft Office User" w:date="2026-10-15T11:10:00Z"/>
-        </w:rPr>
-      </w:pPr>
-    </w:p>
-    <w:p>
-      <w:pPr>
-        <w:rPr>
-          <w:ins w:id="115" w:author="Microsoft Office User" w:date="2026-10-15T11:10:00Z"/>
-          <w:rPrChange w:id="116" w:author="Microsoft Office User" w:date="2026-10-15T11:10:00Z">
+          <w:ins w:id="114" w:author="Microsoft Office User" w:date="2026-10-15T11:21:00Z"/>
+        </w:rPr>
+      </w:pPr>
+    </w:p>
+    <w:p>
+      <w:pPr>
+        <w:rPr>
+          <w:ins w:id="115" w:author="Microsoft Office User" w:date="2026-10-15T11:21:00Z"/>
+        </w:rPr>
+      </w:pPr>
+    </w:p>
+    <w:p>
+      <w:pPr>
+        <w:rPr>
+          <w:ins w:id="116" w:author="Microsoft Office User" w:date="2026-10-15T11:10:00Z"/>
+        </w:rPr>
+      </w:pPr>
+    </w:p>
+    <w:p>
+      <w:pPr>
+        <w:rPr>
+          <w:ins w:id="117" w:author="Microsoft Office User" w:date="2026-10-15T11:10:00Z"/>
+          <w:rPrChange w:id="118" w:author="Microsoft Office User" w:date="2026-10-15T11:10:00Z">
             <w:rPr>
-              <w:ins w:id="117" w:author="Microsoft Office User" w:date="2026-10-15T11:10:00Z"/>
+              <w:ins w:id="119" w:author="Microsoft Office User" w:date="2026-10-15T11:10:00Z"/>
               <w:sz w:val="24"/>
               <w:szCs w:val="24"/>
             </w:rPr>
           </w:rPrChange>
         </w:rPr>
-        <w:pPrChange w:id="118" w:author="Microsoft Office User" w:date="2026-10-15T11:10:00Z">
+        <w:pPrChange w:id="120" w:author="Microsoft Office User" w:date="2026-10-15T11:10:00Z">
           <w:pPr>
             <w:pStyle w:val="Heading1"/>
             <w:spacing w:line="360" w:lineRule="auto"/>
@@ -7888,7 +7919,7 @@
         </w:rPr>
         <w:t>Project Timeline</w:t>
       </w:r>
-      <w:bookmarkEnd w:id="98"/>
+      <w:bookmarkEnd w:id="100"/>
     </w:p>
     <w:p>
       <w:pPr>
@@ -7964,7 +7995,7 @@
         <w:spacing w:line="360" w:lineRule="auto"/>
         <w:jc w:val="both"/>
         <w:rPr>
-          <w:del w:id="119" w:author="Microsoft Office User" w:date="2026-10-15T11:10:00Z"/>
+          <w:del w:id="121" w:author="Microsoft Office User" w:date="2026-10-15T11:10:00Z"/>
           <w:sz w:val="24"/>
           <w:szCs w:val="24"/>
         </w:rPr>
@@ -8007,7 +8038,7 @@
           <w:szCs w:val="24"/>
         </w:rPr>
       </w:pPr>
-      <w:bookmarkStart w:id="120" w:name="_Toc242954871"/>
+      <w:bookmarkStart w:id="122" w:name="_Toc242954871"/>
       <w:r>
         <w:rPr>
           <w:sz w:val="24"/>
@@ -8015,7 +8046,7 @@
         </w:rPr>
         <w:t>Ethical and Legal Considerations</w:t>
       </w:r>
-      <w:bookmarkEnd w:id="120"/>
+      <w:bookmarkEnd w:id="122"/>
     </w:p>
     <w:p>
       <w:pPr>
@@ -8062,7 +8093,7 @@
         </w:rPr>
         <w:t xml:space="preserve"> public data from Eurostats, </w:t>
       </w:r>
-      <w:ins w:id="121" w:author="Microsoft Office User" w:date="2026-10-20T09:23:00Z">
+      <w:ins w:id="123" w:author="Microsoft Office User" w:date="2026-10-20T09:23:00Z">
         <w:r>
           <w:rPr>
             <w:sz w:val="24"/>
@@ -8078,7 +8109,7 @@
         </w:rPr>
         <w:t xml:space="preserve">ECB and </w:t>
       </w:r>
-      <w:ins w:id="122" w:author="Microsoft Office User" w:date="2026-10-20T09:23:00Z">
+      <w:ins w:id="124" w:author="Microsoft Office User" w:date="2026-10-20T09:23:00Z">
         <w:r>
           <w:rPr>
             <w:sz w:val="24"/>
@@ -8217,26 +8248,12 @@
         <w:spacing w:line="360" w:lineRule="auto"/>
         <w:jc w:val="both"/>
         <w:rPr>
-          <w:ins w:id="123" w:author="Microsoft Office User" w:date="2026-10-15T11:11:00Z"/>
-          <w:sz w:val="24"/>
-          <w:szCs w:val="24"/>
-        </w:rPr>
-      </w:pPr>
-      <w:bookmarkStart w:id="124" w:name="_Toc242954872"/>
-    </w:p>
-    <w:p>
-      <w:pPr>
-        <w:rPr>
           <w:ins w:id="125" w:author="Microsoft Office User" w:date="2026-10-15T11:11:00Z"/>
-        </w:rPr>
-      </w:pPr>
-    </w:p>
-    <w:p>
-      <w:pPr>
-        <w:rPr>
-          <w:ins w:id="126" w:author="Microsoft Office User" w:date="2026-10-15T11:11:00Z"/>
-        </w:rPr>
-      </w:pPr>
+          <w:sz w:val="24"/>
+          <w:szCs w:val="24"/>
+        </w:rPr>
+      </w:pPr>
+      <w:bookmarkStart w:id="126" w:name="_Toc242954872"/>
     </w:p>
     <w:p>
       <w:pPr>
@@ -8254,27 +8271,27 @@
     </w:p>
     <w:p>
       <w:pPr>
+        <w:rPr>
+          <w:ins w:id="129" w:author="Microsoft Office User" w:date="2026-10-15T11:11:00Z"/>
+        </w:rPr>
+      </w:pPr>
+    </w:p>
+    <w:p>
+      <w:pPr>
+        <w:rPr>
+          <w:ins w:id="130" w:author="Microsoft Office User" w:date="2026-10-15T11:11:00Z"/>
+        </w:rPr>
+      </w:pPr>
+    </w:p>
+    <w:p>
+      <w:pPr>
         <w:pStyle w:val="Heading1"/>
         <w:spacing w:line="360" w:lineRule="auto"/>
         <w:jc w:val="both"/>
         <w:rPr>
-          <w:ins w:id="129" w:author="Microsoft Office User" w:date="2026-10-15T11:21:00Z"/>
-          <w:sz w:val="24"/>
-          <w:szCs w:val="24"/>
-        </w:rPr>
-      </w:pPr>
-    </w:p>
-    <w:p>
-      <w:pPr>
-        <w:rPr>
-          <w:ins w:id="130" w:author="Microsoft Office User" w:date="2026-10-15T11:21:00Z"/>
-        </w:rPr>
-      </w:pPr>
-    </w:p>
-    <w:p>
-      <w:pPr>
-        <w:rPr>
           <w:ins w:id="131" w:author="Microsoft Office User" w:date="2026-10-15T11:21:00Z"/>
+          <w:sz w:val="24"/>
+          <w:szCs w:val="24"/>
         </w:rPr>
       </w:pPr>
     </w:p>
@@ -8288,23 +8305,37 @@
     <w:p>
       <w:pPr>
         <w:rPr>
-          <w:ins w:id="133" w:author="Microsoft Office User" w:date="2026-10-15T11:38:00Z"/>
-        </w:rPr>
-      </w:pPr>
-    </w:p>
-    <w:p>
-      <w:pPr>
-        <w:rPr>
-          <w:ins w:id="134" w:author="Microsoft Office User" w:date="2026-10-15T11:11:00Z"/>
-          <w:rPrChange w:id="135" w:author="Microsoft Office User" w:date="2026-10-15T11:21:00Z">
+          <w:ins w:id="133" w:author="Microsoft Office User" w:date="2026-10-15T11:21:00Z"/>
+        </w:rPr>
+      </w:pPr>
+    </w:p>
+    <w:p>
+      <w:pPr>
+        <w:rPr>
+          <w:ins w:id="134" w:author="Microsoft Office User" w:date="2026-10-15T11:21:00Z"/>
+        </w:rPr>
+      </w:pPr>
+    </w:p>
+    <w:p>
+      <w:pPr>
+        <w:rPr>
+          <w:ins w:id="135" w:author="Microsoft Office User" w:date="2026-10-15T11:38:00Z"/>
+        </w:rPr>
+      </w:pPr>
+    </w:p>
+    <w:p>
+      <w:pPr>
+        <w:rPr>
+          <w:ins w:id="136" w:author="Microsoft Office User" w:date="2026-10-15T11:11:00Z"/>
+          <w:rPrChange w:id="137" w:author="Microsoft Office User" w:date="2026-10-15T11:21:00Z">
             <w:rPr>
-              <w:ins w:id="136" w:author="Microsoft Office User" w:date="2026-10-15T11:11:00Z"/>
+              <w:ins w:id="138" w:author="Microsoft Office User" w:date="2026-10-15T11:11:00Z"/>
               <w:sz w:val="24"/>
               <w:szCs w:val="24"/>
             </w:rPr>
           </w:rPrChange>
         </w:rPr>
-        <w:pPrChange w:id="137" w:author="Microsoft Office User" w:date="2026-10-15T11:21:00Z">
+        <w:pPrChange w:id="139" w:author="Microsoft Office User" w:date="2026-10-15T11:21:00Z">
           <w:pPr>
             <w:pStyle w:val="Heading1"/>
             <w:spacing w:line="360" w:lineRule="auto"/>
@@ -8316,16 +8347,16 @@
     <w:p>
       <w:pPr>
         <w:rPr>
-          <w:ins w:id="138" w:author="Microsoft Office User" w:date="2026-10-15T11:11:00Z"/>
-          <w:rPrChange w:id="139" w:author="Microsoft Office User" w:date="2026-10-15T11:11:00Z">
+          <w:ins w:id="140" w:author="Microsoft Office User" w:date="2026-10-15T11:11:00Z"/>
+          <w:rPrChange w:id="141" w:author="Microsoft Office User" w:date="2026-10-15T11:11:00Z">
             <w:rPr>
-              <w:ins w:id="140" w:author="Microsoft Office User" w:date="2026-10-15T11:11:00Z"/>
+              <w:ins w:id="142" w:author="Microsoft Office User" w:date="2026-10-15T11:11:00Z"/>
               <w:sz w:val="24"/>
               <w:szCs w:val="24"/>
             </w:rPr>
           </w:rPrChange>
         </w:rPr>
-        <w:pPrChange w:id="141" w:author="Microsoft Office User" w:date="2026-10-15T11:11:00Z">
+        <w:pPrChange w:id="143" w:author="Microsoft Office User" w:date="2026-10-15T11:11:00Z">
           <w:pPr>
             <w:pStyle w:val="Heading1"/>
             <w:spacing w:line="360" w:lineRule="auto"/>
@@ -8352,7 +8383,7 @@
         <w:lastRenderedPageBreak/>
         <w:t>References</w:t>
       </w:r>
-      <w:bookmarkEnd w:id="124"/>
+      <w:bookmarkEnd w:id="126"/>
     </w:p>
     <w:p>
       <w:pPr>
@@ -8513,28 +8544,14 @@
       <w:pPr>
         <w:pStyle w:val="Bibliography"/>
         <w:rPr>
-          <w:ins w:id="142" w:author="Microsoft Office User" w:date="2026-10-15T11:38:00Z"/>
+          <w:ins w:id="144" w:author="Microsoft Office User" w:date="2026-10-15T11:38:00Z"/>
         </w:rPr>
       </w:pPr>
       <w:r>
         <w:fldChar w:fldCharType="end"/>
       </w:r>
-      <w:bookmarkStart w:id="143" w:name="_heading=h.rbtal5s6u0r9" w:colFirst="0" w:colLast="0"/>
-      <w:bookmarkEnd w:id="143"/>
-    </w:p>
-    <w:p>
-      <w:pPr>
-        <w:rPr>
-          <w:ins w:id="144" w:author="Microsoft Office User" w:date="2026-10-15T11:38:00Z"/>
-        </w:rPr>
-      </w:pPr>
-    </w:p>
-    <w:p>
-      <w:pPr>
-        <w:rPr>
-          <w:ins w:id="145" w:author="Microsoft Office User" w:date="2026-10-15T11:38:00Z"/>
-        </w:rPr>
-      </w:pPr>
+      <w:bookmarkStart w:id="145" w:name="_heading=h.rbtal5s6u0r9" w:colFirst="0" w:colLast="0"/>
+      <w:bookmarkEnd w:id="145"/>
     </w:p>
     <w:p>
       <w:pPr>
@@ -8723,7 +8740,21 @@
         <w:rPr>
           <w:ins w:id="172" w:author="Microsoft Office User" w:date="2026-10-15T11:38:00Z"/>
         </w:rPr>
-        <w:pPrChange w:id="173" w:author="Microsoft Office User" w:date="2026-10-15T11:38:00Z">
+      </w:pPr>
+    </w:p>
+    <w:p>
+      <w:pPr>
+        <w:rPr>
+          <w:ins w:id="173" w:author="Microsoft Office User" w:date="2026-10-15T11:38:00Z"/>
+        </w:rPr>
+      </w:pPr>
+    </w:p>
+    <w:p>
+      <w:pPr>
+        <w:rPr>
+          <w:ins w:id="174" w:author="Microsoft Office User" w:date="2026-10-15T11:38:00Z"/>
+        </w:rPr>
+        <w:pPrChange w:id="175" w:author="Microsoft Office User" w:date="2026-10-15T11:38:00Z">
           <w:pPr>
             <w:pStyle w:val="Bibliography"/>
           </w:pPr>
@@ -8733,7 +8764,7 @@
     <w:p>
       <w:pPr>
         <w:rPr>
-          <w:ins w:id="174" w:author="Microsoft Office User" w:date="2026-10-15T11:38:00Z"/>
+          <w:ins w:id="176" w:author="Microsoft Office User" w:date="2026-10-15T11:38:00Z"/>
         </w:rPr>
       </w:pPr>
     </w:p>
@@ -8741,10 +8772,10 @@
       <w:pPr>
         <w:pStyle w:val="Heading2"/>
         <w:rPr>
-          <w:ins w:id="175" w:author="Microsoft Office User" w:date="2026-10-15T11:38:00Z"/>
-        </w:rPr>
-      </w:pPr>
-      <w:ins w:id="176" w:author="Microsoft Office User" w:date="2026-10-15T11:38:00Z">
+          <w:ins w:id="177" w:author="Microsoft Office User" w:date="2026-10-15T11:38:00Z"/>
+        </w:rPr>
+      </w:pPr>
+      <w:ins w:id="178" w:author="Microsoft Office User" w:date="2026-10-15T11:38:00Z">
         <w:r>
           <w:t>Use of Artificial Intelligence</w:t>
         </w:r>
@@ -8754,10 +8785,10 @@
       <w:pPr>
         <w:jc w:val="both"/>
         <w:rPr>
-          <w:ins w:id="177" w:author="Microsoft Office User" w:date="2026-10-15T11:38:00Z"/>
-        </w:rPr>
-      </w:pPr>
-      <w:ins w:id="178" w:author="Microsoft Office User" w:date="2026-10-15T11:38:00Z">
+          <w:ins w:id="179" w:author="Microsoft Office User" w:date="2026-10-15T11:38:00Z"/>
+        </w:rPr>
+      </w:pPr>
+      <w:ins w:id="180" w:author="Microsoft Office User" w:date="2026-10-15T11:38:00Z">
         <w:r>
           <w:t>This assessment applies the AI Fluency Framework — four interconnected competencies for effective, efficient, ethical and safe AI use. Your engagement with AI will be reviewed across all four dimensions:</w:t>
         </w:r>
@@ -8767,7 +8798,7 @@
       <w:pPr>
         <w:jc w:val="both"/>
         <w:rPr>
-          <w:ins w:id="179" w:author="Microsoft Office User" w:date="2026-10-15T11:38:00Z"/>
+          <w:ins w:id="181" w:author="Microsoft Office User" w:date="2026-10-15T11:38:00Z"/>
         </w:rPr>
       </w:pPr>
     </w:p>
@@ -8791,7 +8822,7 @@
       </w:tblGrid>
       <w:tr>
         <w:trPr>
-          <w:ins w:id="180" w:author="Microsoft Office User" w:date="2026-10-15T11:38:00Z"/>
+          <w:ins w:id="182" w:author="Microsoft Office User" w:date="2026-10-15T11:38:00Z"/>
         </w:trPr>
         <w:tc>
           <w:tcPr>
@@ -8807,10 +8838,10 @@
             <w:pPr>
               <w:spacing w:after="40"/>
               <w:rPr>
-                <w:ins w:id="181" w:author="Microsoft Office User" w:date="2026-10-15T11:38:00Z"/>
+                <w:ins w:id="183" w:author="Microsoft Office User" w:date="2026-10-15T11:38:00Z"/>
               </w:rPr>
             </w:pPr>
-            <w:ins w:id="182" w:author="Microsoft Office User" w:date="2026-10-15T11:38:00Z">
+            <w:ins w:id="184" w:author="Microsoft Office User" w:date="2026-10-15T11:38:00Z">
               <w:r>
                 <w:rPr>
                   <w:b/>
@@ -8823,10 +8854,10 @@
           <w:p>
             <w:pPr>
               <w:rPr>
-                <w:ins w:id="183" w:author="Microsoft Office User" w:date="2026-10-15T11:38:00Z"/>
+                <w:ins w:id="185" w:author="Microsoft Office User" w:date="2026-10-15T11:38:00Z"/>
               </w:rPr>
             </w:pPr>
-            <w:ins w:id="184" w:author="Microsoft Office User" w:date="2026-10-15T11:38:00Z">
+            <w:ins w:id="186" w:author="Microsoft Office User" w:date="2026-10-15T11:38:00Z">
               <w:r>
                 <w:t>Setting goals and deciding whether, when and how to engage with AI.</w:t>
               </w:r>
@@ -8847,10 +8878,10 @@
             <w:pPr>
               <w:spacing w:after="40"/>
               <w:rPr>
-                <w:ins w:id="185" w:author="Microsoft Office User" w:date="2026-10-15T11:38:00Z"/>
+                <w:ins w:id="187" w:author="Microsoft Office User" w:date="2026-10-15T11:38:00Z"/>
               </w:rPr>
             </w:pPr>
-            <w:ins w:id="186" w:author="Microsoft Office User" w:date="2026-10-15T11:38:00Z">
+            <w:ins w:id="188" w:author="Microsoft Office User" w:date="2026-10-15T11:38:00Z">
               <w:r>
                 <w:rPr>
                   <w:b/>
@@ -8863,10 +8894,10 @@
           <w:p>
             <w:pPr>
               <w:rPr>
-                <w:ins w:id="187" w:author="Microsoft Office User" w:date="2026-10-15T11:38:00Z"/>
+                <w:ins w:id="189" w:author="Microsoft Office User" w:date="2026-10-15T11:38:00Z"/>
               </w:rPr>
             </w:pPr>
-            <w:ins w:id="188" w:author="Microsoft Office User" w:date="2026-10-15T11:38:00Z">
+            <w:ins w:id="190" w:author="Microsoft Office User" w:date="2026-10-15T11:38:00Z">
               <w:r>
                 <w:t>Effectively describing goals to prompt useful AI behaviours and outputs.</w:t>
               </w:r>
@@ -8876,7 +8907,7 @@
       </w:tr>
       <w:tr>
         <w:trPr>
-          <w:ins w:id="189" w:author="Microsoft Office User" w:date="2026-10-15T11:38:00Z"/>
+          <w:ins w:id="191" w:author="Microsoft Office User" w:date="2026-10-15T11:38:00Z"/>
         </w:trPr>
         <w:tc>
           <w:tcPr>
@@ -8892,10 +8923,10 @@
             <w:pPr>
               <w:spacing w:after="40"/>
               <w:rPr>
-                <w:ins w:id="190" w:author="Microsoft Office User" w:date="2026-10-15T11:38:00Z"/>
+                <w:ins w:id="192" w:author="Microsoft Office User" w:date="2026-10-15T11:38:00Z"/>
               </w:rPr>
             </w:pPr>
-            <w:ins w:id="191" w:author="Microsoft Office User" w:date="2026-10-15T11:38:00Z">
+            <w:ins w:id="193" w:author="Microsoft Office User" w:date="2026-10-15T11:38:00Z">
               <w:r>
                 <w:rPr>
                   <w:b/>
@@ -8908,10 +8939,10 @@
           <w:p>
             <w:pPr>
               <w:rPr>
-                <w:ins w:id="192" w:author="Microsoft Office User" w:date="2026-10-15T11:38:00Z"/>
+                <w:ins w:id="194" w:author="Microsoft Office User" w:date="2026-10-15T11:38:00Z"/>
               </w:rPr>
             </w:pPr>
-            <w:ins w:id="193" w:author="Microsoft Office User" w:date="2026-10-15T11:38:00Z">
+            <w:ins w:id="195" w:author="Microsoft Office User" w:date="2026-10-15T11:38:00Z">
               <w:r>
                 <w:t>Accurately assessing the usefulness of AI outputs and behaviours.</w:t>
               </w:r>
@@ -8932,10 +8963,10 @@
             <w:pPr>
               <w:spacing w:after="40"/>
               <w:rPr>
-                <w:ins w:id="194" w:author="Microsoft Office User" w:date="2026-10-15T11:38:00Z"/>
+                <w:ins w:id="196" w:author="Microsoft Office User" w:date="2026-10-15T11:38:00Z"/>
               </w:rPr>
             </w:pPr>
-            <w:ins w:id="195" w:author="Microsoft Office User" w:date="2026-10-15T11:38:00Z">
+            <w:ins w:id="197" w:author="Microsoft Office User" w:date="2026-10-15T11:38:00Z">
               <w:r>
                 <w:rPr>
                   <w:b/>
@@ -8948,10 +8979,10 @@
           <w:p>
             <w:pPr>
               <w:rPr>
-                <w:ins w:id="196" w:author="Microsoft Office User" w:date="2026-10-15T11:38:00Z"/>
+                <w:ins w:id="198" w:author="Microsoft Office User" w:date="2026-10-15T11:38:00Z"/>
               </w:rPr>
             </w:pPr>
-            <w:ins w:id="197" w:author="Microsoft Office User" w:date="2026-10-15T11:38:00Z">
+            <w:ins w:id="199" w:author="Microsoft Office User" w:date="2026-10-15T11:38:00Z">
               <w:r>
                 <w:t>Taking responsibility for what we do with AI and how we do it.</w:t>
               </w:r>
@@ -8963,7 +8994,7 @@
     <w:p>
       <w:pPr>
         <w:rPr>
-          <w:ins w:id="198" w:author="Microsoft Office User" w:date="2026-10-15T11:38:00Z"/>
+          <w:ins w:id="200" w:author="Microsoft Office User" w:date="2026-10-15T11:38:00Z"/>
           <w:rFonts w:ascii="Arial" w:eastAsia="Arial" w:hAnsi="Arial" w:cs="Arial"/>
           <w:sz w:val="26"/>
           <w:szCs w:val="26"/>
@@ -8981,11 +9012,11 @@
       <w:pPr>
         <w:spacing w:after="100"/>
         <w:rPr>
-          <w:ins w:id="199" w:author="Microsoft Office User" w:date="2026-10-15T11:38:00Z"/>
+          <w:ins w:id="201" w:author="Microsoft Office User" w:date="2026-10-15T11:38:00Z"/>
           <w:color w:val="212529"/>
         </w:rPr>
       </w:pPr>
-      <w:ins w:id="200" w:author="Microsoft Office User" w:date="2026-10-15T11:38:00Z">
+      <w:ins w:id="202" w:author="Microsoft Office User" w:date="2026-10-15T11:38:00Z">
         <w:r>
           <w:rPr>
             <w:color w:val="212529"/>
@@ -8999,11 +9030,11 @@
       <w:pPr>
         <w:spacing w:after="100"/>
         <w:rPr>
-          <w:ins w:id="201" w:author="Microsoft Office User" w:date="2026-10-15T11:38:00Z"/>
+          <w:ins w:id="203" w:author="Microsoft Office User" w:date="2026-10-15T11:38:00Z"/>
           <w:color w:val="212529"/>
         </w:rPr>
       </w:pPr>
-      <w:ins w:id="202" w:author="Microsoft Office User" w:date="2026-10-15T11:38:00Z">
+      <w:ins w:id="204" w:author="Microsoft Office User" w:date="2026-10-15T11:38:00Z">
         <w:r>
           <w:rPr>
             <w:color w:val="212529"/>
@@ -9019,12 +9050,12 @@
         <w:keepLines w:val="0"/>
         <w:spacing w:before="0"/>
         <w:rPr>
-          <w:ins w:id="203" w:author="Microsoft Office User" w:date="2026-10-15T11:38:00Z"/>
+          <w:ins w:id="205" w:author="Microsoft Office User" w:date="2026-10-15T11:38:00Z"/>
           <w:b/>
           <w:bCs/>
         </w:rPr>
       </w:pPr>
-      <w:ins w:id="204" w:author="Microsoft Office User" w:date="2026-10-15T11:38:00Z">
+      <w:ins w:id="206" w:author="Microsoft Office User" w:date="2026-10-15T11:38:00Z">
         <w:r>
           <w:rPr>
             <w:sz w:val="28"/>
@@ -9037,7 +9068,7 @@
     <w:p>
       <w:pPr>
         <w:rPr>
-          <w:ins w:id="205" w:author="Microsoft Office User" w:date="2026-10-15T11:38:00Z"/>
+          <w:ins w:id="207" w:author="Microsoft Office User" w:date="2026-10-15T11:38:00Z"/>
           <w:i/>
           <w:iCs/>
           <w:color w:val="545454"/>
@@ -9045,7 +9076,7 @@
           <w:szCs w:val="20"/>
         </w:rPr>
       </w:pPr>
-      <w:ins w:id="206" w:author="Microsoft Office User" w:date="2026-10-15T11:38:00Z">
+      <w:ins w:id="208" w:author="Microsoft Office User" w:date="2026-10-15T11:38:00Z">
         <w:r>
           <w:rPr>
             <w:i/>
@@ -9061,7 +9092,7 @@
     <w:p>
       <w:pPr>
         <w:rPr>
-          <w:ins w:id="207" w:author="Microsoft Office User" w:date="2026-10-15T11:38:00Z"/>
+          <w:ins w:id="209" w:author="Microsoft Office User" w:date="2026-10-15T11:38:00Z"/>
           <w:i/>
           <w:iCs/>
           <w:color w:val="545454"/>
@@ -9084,7 +9115,7 @@
       </w:tblGrid>
       <w:tr>
         <w:trPr>
-          <w:ins w:id="208" w:author="Microsoft Office User" w:date="2026-10-15T11:38:00Z"/>
+          <w:ins w:id="210" w:author="Microsoft Office User" w:date="2026-10-15T11:38:00Z"/>
         </w:trPr>
         <w:tc>
           <w:tcPr>
@@ -9094,7 +9125,7 @@
           <w:p>
             <w:pPr>
               <w:rPr>
-                <w:ins w:id="209" w:author="Microsoft Office User" w:date="2026-10-15T11:38:00Z"/>
+                <w:ins w:id="211" w:author="Microsoft Office User" w:date="2026-10-15T11:38:00Z"/>
                 <w:i/>
                 <w:iCs/>
                 <w:color w:val="545454"/>
@@ -9103,7 +9134,7 @@
                 <w:highlight w:val="yellow"/>
               </w:rPr>
             </w:pPr>
-            <w:ins w:id="210" w:author="Microsoft Office User" w:date="2026-10-15T11:38:00Z">
+            <w:ins w:id="212" w:author="Microsoft Office User" w:date="2026-10-15T11:38:00Z">
               <w:r>
                 <w:rPr>
                   <w:b/>
@@ -9122,7 +9153,7 @@
           <w:p>
             <w:pPr>
               <w:rPr>
-                <w:ins w:id="211" w:author="Microsoft Office User" w:date="2026-10-15T11:38:00Z"/>
+                <w:ins w:id="213" w:author="Microsoft Office User" w:date="2026-10-15T11:38:00Z"/>
                 <w:i/>
                 <w:iCs/>
                 <w:color w:val="545454"/>
@@ -9131,7 +9162,7 @@
                 <w:highlight w:val="yellow"/>
               </w:rPr>
             </w:pPr>
-            <w:ins w:id="212" w:author="Microsoft Office User" w:date="2026-10-15T11:38:00Z">
+            <w:ins w:id="214" w:author="Microsoft Office User" w:date="2026-10-15T11:38:00Z">
               <w:r>
                 <w:rPr>
                   <w:b/>
@@ -9150,7 +9181,7 @@
           <w:p>
             <w:pPr>
               <w:rPr>
-                <w:ins w:id="213" w:author="Microsoft Office User" w:date="2026-10-15T11:38:00Z"/>
+                <w:ins w:id="215" w:author="Microsoft Office User" w:date="2026-10-15T11:38:00Z"/>
                 <w:i/>
                 <w:iCs/>
                 <w:color w:val="545454"/>
@@ -9159,7 +9190,7 @@
                 <w:highlight w:val="yellow"/>
               </w:rPr>
             </w:pPr>
-            <w:ins w:id="214" w:author="Microsoft Office User" w:date="2026-10-15T11:38:00Z">
+            <w:ins w:id="216" w:author="Microsoft Office User" w:date="2026-10-15T11:38:00Z">
               <w:r>
                 <w:rPr>
                   <w:b/>
@@ -9178,7 +9209,7 @@
           <w:p>
             <w:pPr>
               <w:rPr>
-                <w:ins w:id="215" w:author="Microsoft Office User" w:date="2026-10-15T11:38:00Z"/>
+                <w:ins w:id="217" w:author="Microsoft Office User" w:date="2026-10-15T11:38:00Z"/>
                 <w:i/>
                 <w:iCs/>
                 <w:color w:val="545454"/>
@@ -9187,7 +9218,7 @@
                 <w:highlight w:val="yellow"/>
               </w:rPr>
             </w:pPr>
-            <w:ins w:id="216" w:author="Microsoft Office User" w:date="2026-10-15T11:38:00Z">
+            <w:ins w:id="218" w:author="Microsoft Office User" w:date="2026-10-15T11:38:00Z">
               <w:r>
                 <w:rPr>
                   <w:b/>
@@ -9201,7 +9232,7 @@
       </w:tr>
       <w:tr>
         <w:trPr>
-          <w:ins w:id="217" w:author="Microsoft Office User" w:date="2026-10-15T11:38:00Z"/>
+          <w:ins w:id="219" w:author="Microsoft Office User" w:date="2026-10-15T11:38:00Z"/>
         </w:trPr>
         <w:tc>
           <w:tcPr>
@@ -9210,10 +9241,10 @@
           <w:p>
             <w:pPr>
               <w:rPr>
-                <w:ins w:id="218" w:author="Microsoft Office User" w:date="2026-10-15T11:38:00Z"/>
+                <w:ins w:id="220" w:author="Microsoft Office User" w:date="2026-10-15T11:38:00Z"/>
               </w:rPr>
             </w:pPr>
-            <w:ins w:id="219" w:author="Microsoft Office User" w:date="2026-10-15T11:38:00Z">
+            <w:ins w:id="221" w:author="Microsoft Office User" w:date="2026-10-15T11:38:00Z">
               <w:r>
                 <w:rPr>
                   <w:b/>
@@ -9226,7 +9257,7 @@
           <w:p>
             <w:pPr>
               <w:rPr>
-                <w:ins w:id="220" w:author="Microsoft Office User" w:date="2026-10-15T11:38:00Z"/>
+                <w:ins w:id="222" w:author="Microsoft Office User" w:date="2026-10-15T11:38:00Z"/>
                 <w:i/>
                 <w:iCs/>
                 <w:color w:val="545454"/>
@@ -9234,7 +9265,7 @@
                 <w:szCs w:val="20"/>
               </w:rPr>
             </w:pPr>
-            <w:ins w:id="221" w:author="Microsoft Office User" w:date="2026-10-15T11:38:00Z">
+            <w:ins w:id="223" w:author="Microsoft Office User" w:date="2026-10-15T11:38:00Z">
               <w:r>
                 <w:rPr>
                   <w:i/>
@@ -9252,7 +9283,7 @@
           <w:p>
             <w:pPr>
               <w:rPr>
-                <w:ins w:id="222" w:author="Microsoft Office User" w:date="2026-10-15T11:38:00Z"/>
+                <w:ins w:id="224" w:author="Microsoft Office User" w:date="2026-10-15T11:38:00Z"/>
                 <w:i/>
                 <w:iCs/>
                 <w:color w:val="545454"/>
@@ -9260,7 +9291,7 @@
                 <w:szCs w:val="20"/>
               </w:rPr>
             </w:pPr>
-            <w:ins w:id="223" w:author="Microsoft Office User" w:date="2026-10-15T11:38:00Z">
+            <w:ins w:id="225" w:author="Microsoft Office User" w:date="2026-10-15T11:38:00Z">
               <w:r>
                 <w:t>Identify the specific tasks in this assessment where you chose to use AI, and explain your reasoning. Where did AI add value? Where did you decide not to use it, and why?</w:t>
               </w:r>
@@ -9274,7 +9305,7 @@
           <w:p>
             <w:pPr>
               <w:rPr>
-                <w:ins w:id="224" w:author="Microsoft Office User" w:date="2026-10-15T11:38:00Z"/>
+                <w:ins w:id="226" w:author="Microsoft Office User" w:date="2026-10-15T11:38:00Z"/>
                 <w:b/>
                 <w:bCs/>
                 <w:sz w:val="20"/>
@@ -9285,12 +9316,12 @@
           <w:p>
             <w:pPr>
               <w:rPr>
-                <w:ins w:id="225" w:author="Microsoft Office User" w:date="2026-10-15T11:38:00Z"/>
+                <w:ins w:id="227" w:author="Microsoft Office User" w:date="2026-10-15T11:38:00Z"/>
                 <w:sz w:val="20"/>
                 <w:szCs w:val="20"/>
               </w:rPr>
             </w:pPr>
-            <w:ins w:id="226" w:author="Microsoft Office User" w:date="2026-10-15T11:38:00Z">
+            <w:ins w:id="228" w:author="Microsoft Office User" w:date="2026-10-15T11:38:00Z">
               <w:r>
                 <w:rPr>
                   <w:sz w:val="20"/>
@@ -9317,7 +9348,7 @@
           <w:p>
             <w:pPr>
               <w:rPr>
-                <w:ins w:id="227" w:author="Microsoft Office User" w:date="2026-10-15T11:38:00Z"/>
+                <w:ins w:id="229" w:author="Microsoft Office User" w:date="2026-10-15T11:38:00Z"/>
                 <w:b/>
                 <w:bCs/>
                 <w:sz w:val="20"/>
@@ -9328,7 +9359,7 @@
           <w:p>
             <w:pPr>
               <w:rPr>
-                <w:ins w:id="228" w:author="Microsoft Office User" w:date="2026-10-15T11:38:00Z"/>
+                <w:ins w:id="230" w:author="Microsoft Office User" w:date="2026-10-15T11:38:00Z"/>
                 <w:b/>
                 <w:bCs/>
                 <w:sz w:val="20"/>
@@ -9345,7 +9376,7 @@
               </w:numPr>
               <w:ind w:left="403"/>
               <w:rPr>
-                <w:ins w:id="229" w:author="Microsoft Office User" w:date="2026-10-15T11:38:00Z"/>
+                <w:ins w:id="231" w:author="Microsoft Office User" w:date="2026-10-15T11:38:00Z"/>
                 <w:b/>
                 <w:bCs/>
                 <w:color w:val="545454"/>
@@ -9362,13 +9393,13 @@
           <w:p>
             <w:pPr>
               <w:rPr>
-                <w:ins w:id="230" w:author="Microsoft Office User" w:date="2026-10-15T11:38:00Z"/>
+                <w:ins w:id="232" w:author="Microsoft Office User" w:date="2026-10-15T11:38:00Z"/>
                 <w:color w:val="000000" w:themeColor="text1"/>
                 <w:sz w:val="20"/>
                 <w:szCs w:val="20"/>
-                <w:rPrChange w:id="231" w:author="Microsoft Office User" w:date="2026-10-15T11:52:00Z">
+                <w:rPrChange w:id="233" w:author="Microsoft Office User" w:date="2026-10-15T11:52:00Z">
                   <w:rPr>
-                    <w:ins w:id="232" w:author="Microsoft Office User" w:date="2026-10-15T11:38:00Z"/>
+                    <w:ins w:id="234" w:author="Microsoft Office User" w:date="2026-10-15T11:38:00Z"/>
                     <w:color w:val="545454"/>
                     <w:sz w:val="20"/>
                     <w:szCs w:val="20"/>
@@ -9376,13 +9407,13 @@
                 </w:rPrChange>
               </w:rPr>
             </w:pPr>
-            <w:ins w:id="233" w:author="Microsoft Office User" w:date="2026-10-15T11:49:00Z">
+            <w:ins w:id="235" w:author="Microsoft Office User" w:date="2026-10-15T11:49:00Z">
               <w:r>
                 <w:rPr>
                   <w:color w:val="000000" w:themeColor="text1"/>
                   <w:sz w:val="20"/>
                   <w:szCs w:val="20"/>
-                  <w:rPrChange w:id="234" w:author="Microsoft Office User" w:date="2026-10-15T11:52:00Z">
+                  <w:rPrChange w:id="236" w:author="Microsoft Office User" w:date="2026-10-15T11:52:00Z">
                     <w:rPr>
                       <w:color w:val="545454"/>
                       <w:sz w:val="20"/>
@@ -9393,7 +9424,7 @@
                 <w:t xml:space="preserve">Grammarly check the </w:t>
               </w:r>
             </w:ins>
-            <w:ins w:id="235" w:author="Microsoft Office User" w:date="2026-10-20T09:23:00Z">
+            <w:ins w:id="237" w:author="Microsoft Office User" w:date="2026-10-20T09:23:00Z">
               <w:r>
                 <w:rPr>
                   <w:color w:val="000000" w:themeColor="text1"/>
@@ -9403,13 +9434,13 @@
                 <w:t>orthography</w:t>
               </w:r>
             </w:ins>
-            <w:ins w:id="236" w:author="Microsoft Office User" w:date="2026-10-15T11:49:00Z">
+            <w:ins w:id="238" w:author="Microsoft Office User" w:date="2026-10-15T11:49:00Z">
               <w:r>
                 <w:rPr>
                   <w:color w:val="000000" w:themeColor="text1"/>
                   <w:sz w:val="20"/>
                   <w:szCs w:val="20"/>
-                  <w:rPrChange w:id="237" w:author="Microsoft Office User" w:date="2026-10-15T11:52:00Z">
+                  <w:rPrChange w:id="239" w:author="Microsoft Office User" w:date="2026-10-15T11:52:00Z">
                     <w:rPr>
                       <w:color w:val="545454"/>
                       <w:sz w:val="20"/>
@@ -9420,13 +9451,13 @@
                 <w:t xml:space="preserve"> of the completely document, I dec</w:t>
               </w:r>
             </w:ins>
-            <w:ins w:id="238" w:author="Microsoft Office User" w:date="2026-10-15T11:50:00Z">
+            <w:ins w:id="240" w:author="Microsoft Office User" w:date="2026-10-15T11:50:00Z">
               <w:r>
                 <w:rPr>
                   <w:color w:val="000000" w:themeColor="text1"/>
                   <w:sz w:val="20"/>
                   <w:szCs w:val="20"/>
-                  <w:rPrChange w:id="239" w:author="Microsoft Office User" w:date="2026-10-15T11:52:00Z">
+                  <w:rPrChange w:id="241" w:author="Microsoft Office User" w:date="2026-10-15T11:52:00Z">
                     <w:rPr>
                       <w:color w:val="545454"/>
                       <w:sz w:val="20"/>
@@ -9442,7 +9473,7 @@
       </w:tr>
       <w:tr>
         <w:trPr>
-          <w:ins w:id="240" w:author="Microsoft Office User" w:date="2026-10-15T11:38:00Z"/>
+          <w:ins w:id="242" w:author="Microsoft Office User" w:date="2026-10-15T11:38:00Z"/>
         </w:trPr>
         <w:tc>
           <w:tcPr>
@@ -9451,10 +9482,10 @@
           <w:p>
             <w:pPr>
               <w:rPr>
-                <w:ins w:id="241" w:author="Microsoft Office User" w:date="2026-10-15T11:38:00Z"/>
+                <w:ins w:id="243" w:author="Microsoft Office User" w:date="2026-10-15T11:38:00Z"/>
               </w:rPr>
             </w:pPr>
-            <w:ins w:id="242" w:author="Microsoft Office User" w:date="2026-10-15T11:38:00Z">
+            <w:ins w:id="244" w:author="Microsoft Office User" w:date="2026-10-15T11:38:00Z">
               <w:r>
                 <w:rPr>
                   <w:b/>
@@ -9467,7 +9498,7 @@
           <w:p>
             <w:pPr>
               <w:rPr>
-                <w:ins w:id="243" w:author="Microsoft Office User" w:date="2026-10-15T11:38:00Z"/>
+                <w:ins w:id="245" w:author="Microsoft Office User" w:date="2026-10-15T11:38:00Z"/>
                 <w:i/>
                 <w:iCs/>
                 <w:color w:val="545454"/>
@@ -9475,7 +9506,7 @@
                 <w:szCs w:val="20"/>
               </w:rPr>
             </w:pPr>
-            <w:ins w:id="244" w:author="Microsoft Office User" w:date="2026-10-15T11:38:00Z">
+            <w:ins w:id="246" w:author="Microsoft Office User" w:date="2026-10-15T11:38:00Z">
               <w:r>
                 <w:rPr>
                   <w:i/>
@@ -9493,7 +9524,7 @@
           <w:p>
             <w:pPr>
               <w:rPr>
-                <w:ins w:id="245" w:author="Microsoft Office User" w:date="2026-10-15T11:38:00Z"/>
+                <w:ins w:id="247" w:author="Microsoft Office User" w:date="2026-10-15T11:38:00Z"/>
                 <w:i/>
                 <w:iCs/>
                 <w:color w:val="545454"/>
@@ -9501,7 +9532,7 @@
                 <w:szCs w:val="20"/>
               </w:rPr>
             </w:pPr>
-            <w:ins w:id="246" w:author="Microsoft Office User" w:date="2026-10-15T11:38:00Z">
+            <w:ins w:id="248" w:author="Microsoft Office User" w:date="2026-10-15T11:38:00Z">
               <w:r>
                 <w:t>Include the exact prompts you used in your appendix (recorded on the AI Tools declaration). Reflect on how you communicated your goals to the AI — did you need to iterate or refine your prompts to get useful output?</w:t>
               </w:r>
@@ -9515,12 +9546,12 @@
           <w:p>
             <w:pPr>
               <w:rPr>
-                <w:ins w:id="247" w:author="Microsoft Office User" w:date="2026-10-15T11:38:00Z"/>
+                <w:ins w:id="249" w:author="Microsoft Office User" w:date="2026-10-15T11:38:00Z"/>
                 <w:sz w:val="20"/>
                 <w:szCs w:val="20"/>
               </w:rPr>
             </w:pPr>
-            <w:ins w:id="248" w:author="Microsoft Office User" w:date="2026-10-15T11:38:00Z">
+            <w:ins w:id="250" w:author="Microsoft Office User" w:date="2026-10-15T11:38:00Z">
               <w:r>
                 <w:rPr>
                   <w:sz w:val="20"/>
@@ -9547,7 +9578,7 @@
           <w:p>
             <w:pPr>
               <w:rPr>
-                <w:ins w:id="249" w:author="Microsoft Office User" w:date="2026-10-15T11:38:00Z"/>
+                <w:ins w:id="251" w:author="Microsoft Office User" w:date="2026-10-15T11:38:00Z"/>
                 <w:sz w:val="20"/>
                 <w:szCs w:val="20"/>
               </w:rPr>
@@ -9556,7 +9587,7 @@
           <w:p>
             <w:pPr>
               <w:rPr>
-                <w:ins w:id="250" w:author="Microsoft Office User" w:date="2026-10-15T11:38:00Z"/>
+                <w:ins w:id="252" w:author="Microsoft Office User" w:date="2026-10-15T11:38:00Z"/>
                 <w:sz w:val="20"/>
                 <w:szCs w:val="20"/>
               </w:rPr>
@@ -9565,7 +9596,7 @@
           <w:p>
             <w:pPr>
               <w:rPr>
-                <w:ins w:id="251" w:author="Microsoft Office User" w:date="2026-10-15T11:38:00Z"/>
+                <w:ins w:id="253" w:author="Microsoft Office User" w:date="2026-10-15T11:38:00Z"/>
                 <w:sz w:val="20"/>
                 <w:szCs w:val="20"/>
               </w:rPr>
@@ -9574,7 +9605,7 @@
           <w:p>
             <w:pPr>
               <w:rPr>
-                <w:ins w:id="252" w:author="Microsoft Office User" w:date="2026-10-15T11:38:00Z"/>
+                <w:ins w:id="254" w:author="Microsoft Office User" w:date="2026-10-15T11:38:00Z"/>
                 <w:sz w:val="20"/>
                 <w:szCs w:val="20"/>
               </w:rPr>
@@ -9588,36 +9619,20 @@
           <w:p>
             <w:pPr>
               <w:rPr>
-                <w:ins w:id="253" w:author="Microsoft Office User" w:date="2026-10-15T11:38:00Z"/>
+                <w:ins w:id="255" w:author="Microsoft Office User" w:date="2026-10-15T11:38:00Z"/>
                 <w:color w:val="000000" w:themeColor="text1"/>
                 <w:sz w:val="20"/>
                 <w:szCs w:val="20"/>
-                <w:rPrChange w:id="254" w:author="Microsoft Office User" w:date="2026-10-15T11:52:00Z">
+                <w:rPrChange w:id="256" w:author="Microsoft Office User" w:date="2026-10-15T11:52:00Z">
                   <w:rPr>
-                    <w:ins w:id="255" w:author="Microsoft Office User" w:date="2026-10-15T11:38:00Z"/>
+                    <w:ins w:id="257" w:author="Microsoft Office User" w:date="2026-10-15T11:38:00Z"/>
                     <w:sz w:val="20"/>
                     <w:szCs w:val="20"/>
                   </w:rPr>
                 </w:rPrChange>
               </w:rPr>
             </w:pPr>
-            <w:ins w:id="256" w:author="Microsoft Office User" w:date="2026-10-15T11:50:00Z">
-              <w:r>
-                <w:rPr>
-                  <w:color w:val="000000" w:themeColor="text1"/>
-                  <w:sz w:val="20"/>
-                  <w:szCs w:val="20"/>
-                  <w:rPrChange w:id="257" w:author="Microsoft Office User" w:date="2026-10-15T11:52:00Z">
-                    <w:rPr>
-                      <w:sz w:val="20"/>
-                      <w:szCs w:val="20"/>
-                    </w:rPr>
-                  </w:rPrChange>
-                </w:rPr>
-                <w:t>I just did a document in Grammarly when I had finished to</w:t>
-              </w:r>
-            </w:ins>
-            <w:ins w:id="258" w:author="Microsoft Office User" w:date="2026-10-15T11:51:00Z">
+            <w:ins w:id="258" w:author="Microsoft Office User" w:date="2026-10-15T11:50:00Z">
               <w:r>
                 <w:rPr>
                   <w:color w:val="000000" w:themeColor="text1"/>
@@ -9630,6 +9645,22 @@
                     </w:rPr>
                   </w:rPrChange>
                 </w:rPr>
+                <w:t>I just did a document in Grammarly when I had finished to</w:t>
+              </w:r>
+            </w:ins>
+            <w:ins w:id="260" w:author="Microsoft Office User" w:date="2026-10-15T11:51:00Z">
+              <w:r>
+                <w:rPr>
+                  <w:color w:val="000000" w:themeColor="text1"/>
+                  <w:sz w:val="20"/>
+                  <w:szCs w:val="20"/>
+                  <w:rPrChange w:id="261" w:author="Microsoft Office User" w:date="2026-10-15T11:52:00Z">
+                    <w:rPr>
+                      <w:sz w:val="20"/>
+                      <w:szCs w:val="20"/>
+                    </w:rPr>
+                  </w:rPrChange>
+                </w:rPr>
                 <w:t xml:space="preserve"> write the project.</w:t>
               </w:r>
             </w:ins>
@@ -9637,13 +9668,13 @@
           <w:p>
             <w:pPr>
               <w:rPr>
-                <w:ins w:id="260" w:author="Microsoft Office User" w:date="2026-10-15T11:38:00Z"/>
+                <w:ins w:id="262" w:author="Microsoft Office User" w:date="2026-10-15T11:38:00Z"/>
                 <w:color w:val="000000" w:themeColor="text1"/>
                 <w:sz w:val="20"/>
                 <w:szCs w:val="20"/>
-                <w:rPrChange w:id="261" w:author="Microsoft Office User" w:date="2026-10-15T11:52:00Z">
+                <w:rPrChange w:id="263" w:author="Microsoft Office User" w:date="2026-10-15T11:52:00Z">
                   <w:rPr>
-                    <w:ins w:id="262" w:author="Microsoft Office User" w:date="2026-10-15T11:38:00Z"/>
+                    <w:ins w:id="264" w:author="Microsoft Office User" w:date="2026-10-15T11:38:00Z"/>
                     <w:sz w:val="20"/>
                     <w:szCs w:val="20"/>
                   </w:rPr>
@@ -9654,13 +9685,13 @@
           <w:p>
             <w:pPr>
               <w:rPr>
-                <w:ins w:id="263" w:author="Microsoft Office User" w:date="2026-10-15T11:38:00Z"/>
+                <w:ins w:id="265" w:author="Microsoft Office User" w:date="2026-10-15T11:38:00Z"/>
                 <w:color w:val="000000" w:themeColor="text1"/>
                 <w:sz w:val="20"/>
                 <w:szCs w:val="20"/>
-                <w:rPrChange w:id="264" w:author="Microsoft Office User" w:date="2026-10-15T11:52:00Z">
+                <w:rPrChange w:id="266" w:author="Microsoft Office User" w:date="2026-10-15T11:52:00Z">
                   <w:rPr>
-                    <w:ins w:id="265" w:author="Microsoft Office User" w:date="2026-10-15T11:38:00Z"/>
+                    <w:ins w:id="267" w:author="Microsoft Office User" w:date="2026-10-15T11:38:00Z"/>
                     <w:sz w:val="20"/>
                     <w:szCs w:val="20"/>
                   </w:rPr>
@@ -9671,13 +9702,13 @@
           <w:p>
             <w:pPr>
               <w:rPr>
-                <w:ins w:id="266" w:author="Microsoft Office User" w:date="2026-10-15T11:38:00Z"/>
+                <w:ins w:id="268" w:author="Microsoft Office User" w:date="2026-10-15T11:38:00Z"/>
                 <w:color w:val="000000" w:themeColor="text1"/>
                 <w:sz w:val="20"/>
                 <w:szCs w:val="20"/>
-                <w:rPrChange w:id="267" w:author="Microsoft Office User" w:date="2026-10-15T11:52:00Z">
+                <w:rPrChange w:id="269" w:author="Microsoft Office User" w:date="2026-10-15T11:52:00Z">
                   <w:rPr>
-                    <w:ins w:id="268" w:author="Microsoft Office User" w:date="2026-10-15T11:38:00Z"/>
+                    <w:ins w:id="270" w:author="Microsoft Office User" w:date="2026-10-15T11:38:00Z"/>
                     <w:sz w:val="20"/>
                     <w:szCs w:val="20"/>
                   </w:rPr>
@@ -9689,7 +9720,7 @@
       </w:tr>
       <w:tr>
         <w:trPr>
-          <w:ins w:id="269" w:author="Microsoft Office User" w:date="2026-10-15T11:38:00Z"/>
+          <w:ins w:id="271" w:author="Microsoft Office User" w:date="2026-10-15T11:38:00Z"/>
         </w:trPr>
         <w:tc>
           <w:tcPr>
@@ -9698,10 +9729,10 @@
           <w:p>
             <w:pPr>
               <w:rPr>
-                <w:ins w:id="270" w:author="Microsoft Office User" w:date="2026-10-15T11:38:00Z"/>
+                <w:ins w:id="272" w:author="Microsoft Office User" w:date="2026-10-15T11:38:00Z"/>
               </w:rPr>
             </w:pPr>
-            <w:ins w:id="271" w:author="Microsoft Office User" w:date="2026-10-15T11:38:00Z">
+            <w:ins w:id="273" w:author="Microsoft Office User" w:date="2026-10-15T11:38:00Z">
               <w:r>
                 <w:rPr>
                   <w:b/>
@@ -9714,7 +9745,7 @@
           <w:p>
             <w:pPr>
               <w:rPr>
-                <w:ins w:id="272" w:author="Microsoft Office User" w:date="2026-10-15T11:38:00Z"/>
+                <w:ins w:id="274" w:author="Microsoft Office User" w:date="2026-10-15T11:38:00Z"/>
                 <w:i/>
                 <w:iCs/>
                 <w:color w:val="545454"/>
@@ -9722,7 +9753,7 @@
                 <w:szCs w:val="20"/>
               </w:rPr>
             </w:pPr>
-            <w:ins w:id="273" w:author="Microsoft Office User" w:date="2026-10-15T11:38:00Z">
+            <w:ins w:id="275" w:author="Microsoft Office User" w:date="2026-10-15T11:38:00Z">
               <w:r>
                 <w:rPr>
                   <w:i/>
@@ -9740,7 +9771,7 @@
           <w:p>
             <w:pPr>
               <w:rPr>
-                <w:ins w:id="274" w:author="Microsoft Office User" w:date="2026-10-15T11:38:00Z"/>
+                <w:ins w:id="276" w:author="Microsoft Office User" w:date="2026-10-15T11:38:00Z"/>
                 <w:i/>
                 <w:iCs/>
                 <w:color w:val="545454"/>
@@ -9748,7 +9779,7 @@
                 <w:szCs w:val="20"/>
               </w:rPr>
             </w:pPr>
-            <w:ins w:id="275" w:author="Microsoft Office User" w:date="2026-10-15T11:38:00Z">
+            <w:ins w:id="277" w:author="Microsoft Office User" w:date="2026-10-15T11:38:00Z">
               <w:r>
                 <w:t>In your reflection, critically evaluate the AI output: what did you accept, modify, or reject — and why? Assess accuracy, relevance, and quality. You are responsible for verifying all AI-generated content before submitting.</w:t>
               </w:r>
@@ -9762,7 +9793,7 @@
           <w:p>
             <w:pPr>
               <w:rPr>
-                <w:ins w:id="276" w:author="Microsoft Office User" w:date="2026-10-15T11:38:00Z"/>
+                <w:ins w:id="278" w:author="Microsoft Office User" w:date="2026-10-15T11:38:00Z"/>
                 <w:sz w:val="20"/>
                 <w:szCs w:val="20"/>
               </w:rPr>
@@ -9771,12 +9802,12 @@
           <w:p>
             <w:pPr>
               <w:rPr>
-                <w:ins w:id="277" w:author="Microsoft Office User" w:date="2026-10-15T11:38:00Z"/>
+                <w:ins w:id="279" w:author="Microsoft Office User" w:date="2026-10-15T11:38:00Z"/>
                 <w:sz w:val="20"/>
                 <w:szCs w:val="20"/>
               </w:rPr>
             </w:pPr>
-            <w:ins w:id="278" w:author="Microsoft Office User" w:date="2026-10-15T11:38:00Z">
+            <w:ins w:id="280" w:author="Microsoft Office User" w:date="2026-10-15T11:38:00Z">
               <w:r>
                 <w:rPr>
                   <w:sz w:val="20"/>
@@ -9803,7 +9834,7 @@
           <w:p>
             <w:pPr>
               <w:rPr>
-                <w:ins w:id="279" w:author="Microsoft Office User" w:date="2026-10-15T11:38:00Z"/>
+                <w:ins w:id="281" w:author="Microsoft Office User" w:date="2026-10-15T11:38:00Z"/>
                 <w:sz w:val="20"/>
                 <w:szCs w:val="20"/>
               </w:rPr>
@@ -9812,7 +9843,7 @@
           <w:p>
             <w:pPr>
               <w:rPr>
-                <w:ins w:id="280" w:author="Microsoft Office User" w:date="2026-10-15T11:38:00Z"/>
+                <w:ins w:id="282" w:author="Microsoft Office User" w:date="2026-10-15T11:38:00Z"/>
                 <w:color w:val="545454"/>
                 <w:sz w:val="20"/>
                 <w:szCs w:val="20"/>
@@ -9827,13 +9858,13 @@
           <w:p>
             <w:pPr>
               <w:rPr>
-                <w:ins w:id="281" w:author="Microsoft Office User" w:date="2026-10-15T11:38:00Z"/>
+                <w:ins w:id="283" w:author="Microsoft Office User" w:date="2026-10-15T11:38:00Z"/>
                 <w:color w:val="000000" w:themeColor="text1"/>
                 <w:sz w:val="20"/>
                 <w:szCs w:val="20"/>
               </w:rPr>
             </w:pPr>
-            <w:ins w:id="282" w:author="Microsoft Office User" w:date="2026-10-15T11:51:00Z">
+            <w:ins w:id="284" w:author="Microsoft Office User" w:date="2026-10-15T11:51:00Z">
               <w:r>
                 <w:rPr>
                   <w:color w:val="000000" w:themeColor="text1"/>
@@ -9843,7 +9874,7 @@
                 <w:t xml:space="preserve">I accepted all the </w:t>
               </w:r>
             </w:ins>
-            <w:ins w:id="283" w:author="Microsoft Office User" w:date="2026-10-20T09:23:00Z">
+            <w:ins w:id="285" w:author="Microsoft Office User" w:date="2026-10-20T09:23:00Z">
               <w:r>
                 <w:rPr>
                   <w:color w:val="000000" w:themeColor="text1"/>
@@ -9853,7 +9884,7 @@
                 <w:t>orthography</w:t>
               </w:r>
             </w:ins>
-            <w:ins w:id="284" w:author="Microsoft Office User" w:date="2026-10-15T11:51:00Z">
+            <w:ins w:id="286" w:author="Microsoft Office User" w:date="2026-10-15T11:51:00Z">
               <w:r>
                 <w:rPr>
                   <w:color w:val="000000" w:themeColor="text1"/>
@@ -9863,7 +9894,7 @@
                 <w:t xml:space="preserve"> modify that the program suggested</w:t>
               </w:r>
             </w:ins>
-            <w:ins w:id="285" w:author="Microsoft Office User" w:date="2026-10-15T11:52:00Z">
+            <w:ins w:id="287" w:author="Microsoft Office User" w:date="2026-10-15T11:52:00Z">
               <w:r>
                 <w:rPr>
                   <w:color w:val="000000" w:themeColor="text1"/>
@@ -9877,15 +9908,15 @@
           <w:p>
             <w:pPr>
               <w:rPr>
-                <w:ins w:id="286" w:author="Microsoft Office User" w:date="2026-10-15T11:38:00Z"/>
+                <w:ins w:id="288" w:author="Microsoft Office User" w:date="2026-10-15T11:38:00Z"/>
                 <w:i/>
                 <w:iCs/>
                 <w:color w:val="000000" w:themeColor="text1"/>
                 <w:sz w:val="20"/>
                 <w:szCs w:val="20"/>
-                <w:rPrChange w:id="287" w:author="Microsoft Office User" w:date="2026-10-15T11:52:00Z">
+                <w:rPrChange w:id="289" w:author="Microsoft Office User" w:date="2026-10-15T11:52:00Z">
                   <w:rPr>
-                    <w:ins w:id="288" w:author="Microsoft Office User" w:date="2026-10-15T11:38:00Z"/>
+                    <w:ins w:id="290" w:author="Microsoft Office User" w:date="2026-10-15T11:38:00Z"/>
                     <w:i/>
                     <w:iCs/>
                     <w:color w:val="545454"/>
@@ -9899,15 +9930,15 @@
           <w:p>
             <w:pPr>
               <w:rPr>
-                <w:ins w:id="289" w:author="Microsoft Office User" w:date="2026-10-15T11:38:00Z"/>
+                <w:ins w:id="291" w:author="Microsoft Office User" w:date="2026-10-15T11:38:00Z"/>
                 <w:i/>
                 <w:iCs/>
                 <w:color w:val="000000" w:themeColor="text1"/>
                 <w:sz w:val="20"/>
                 <w:szCs w:val="20"/>
-                <w:rPrChange w:id="290" w:author="Microsoft Office User" w:date="2026-10-15T11:52:00Z">
+                <w:rPrChange w:id="292" w:author="Microsoft Office User" w:date="2026-10-15T11:52:00Z">
                   <w:rPr>
-                    <w:ins w:id="291" w:author="Microsoft Office User" w:date="2026-10-15T11:38:00Z"/>
+                    <w:ins w:id="293" w:author="Microsoft Office User" w:date="2026-10-15T11:38:00Z"/>
                     <w:i/>
                     <w:iCs/>
                     <w:color w:val="545454"/>
@@ -9921,15 +9952,15 @@
           <w:p>
             <w:pPr>
               <w:rPr>
-                <w:ins w:id="292" w:author="Microsoft Office User" w:date="2026-10-15T11:38:00Z"/>
+                <w:ins w:id="294" w:author="Microsoft Office User" w:date="2026-10-15T11:38:00Z"/>
                 <w:i/>
                 <w:iCs/>
                 <w:color w:val="000000" w:themeColor="text1"/>
                 <w:sz w:val="20"/>
                 <w:szCs w:val="20"/>
-                <w:rPrChange w:id="293" w:author="Microsoft Office User" w:date="2026-10-15T11:52:00Z">
+                <w:rPrChange w:id="295" w:author="Microsoft Office User" w:date="2026-10-15T11:52:00Z">
                   <w:rPr>
-                    <w:ins w:id="294" w:author="Microsoft Office User" w:date="2026-10-15T11:38:00Z"/>
+                    <w:ins w:id="296" w:author="Microsoft Office User" w:date="2026-10-15T11:38:00Z"/>
                     <w:i/>
                     <w:iCs/>
                     <w:color w:val="545454"/>
@@ -9943,15 +9974,15 @@
           <w:p>
             <w:pPr>
               <w:rPr>
-                <w:ins w:id="295" w:author="Microsoft Office User" w:date="2026-10-15T11:38:00Z"/>
+                <w:ins w:id="297" w:author="Microsoft Office User" w:date="2026-10-15T11:38:00Z"/>
                 <w:i/>
                 <w:iCs/>
                 <w:color w:val="000000" w:themeColor="text1"/>
                 <w:sz w:val="20"/>
                 <w:szCs w:val="20"/>
-                <w:rPrChange w:id="296" w:author="Microsoft Office User" w:date="2026-10-15T11:52:00Z">
+                <w:rPrChange w:id="298" w:author="Microsoft Office User" w:date="2026-10-15T11:52:00Z">
                   <w:rPr>
-                    <w:ins w:id="297" w:author="Microsoft Office User" w:date="2026-10-15T11:38:00Z"/>
+                    <w:ins w:id="299" w:author="Microsoft Office User" w:date="2026-10-15T11:38:00Z"/>
                     <w:i/>
                     <w:iCs/>
                     <w:color w:val="545454"/>
@@ -9967,7 +9998,7 @@
       <w:tr>
         <w:trPr>
           <w:trHeight w:val="3034"/>
-          <w:ins w:id="298" w:author="Microsoft Office User" w:date="2026-10-15T11:38:00Z"/>
+          <w:ins w:id="300" w:author="Microsoft Office User" w:date="2026-10-15T11:38:00Z"/>
         </w:trPr>
         <w:tc>
           <w:tcPr>
@@ -9976,10 +10007,10 @@
           <w:p>
             <w:pPr>
               <w:rPr>
-                <w:ins w:id="299" w:author="Microsoft Office User" w:date="2026-10-15T11:38:00Z"/>
+                <w:ins w:id="301" w:author="Microsoft Office User" w:date="2026-10-15T11:38:00Z"/>
               </w:rPr>
             </w:pPr>
-            <w:ins w:id="300" w:author="Microsoft Office User" w:date="2026-10-15T11:38:00Z">
+            <w:ins w:id="302" w:author="Microsoft Office User" w:date="2026-10-15T11:38:00Z">
               <w:r>
                 <w:rPr>
                   <w:b/>
@@ -9992,12 +10023,12 @@
           <w:p>
             <w:pPr>
               <w:rPr>
-                <w:ins w:id="301" w:author="Microsoft Office User" w:date="2026-10-15T11:38:00Z"/>
+                <w:ins w:id="303" w:author="Microsoft Office User" w:date="2026-10-15T11:38:00Z"/>
                 <w:b/>
                 <w:bCs/>
               </w:rPr>
             </w:pPr>
-            <w:ins w:id="302" w:author="Microsoft Office User" w:date="2026-10-15T11:38:00Z">
+            <w:ins w:id="304" w:author="Microsoft Office User" w:date="2026-10-15T11:38:00Z">
               <w:r>
                 <w:rPr>
                   <w:i/>
@@ -10015,7 +10046,7 @@
           <w:p>
             <w:pPr>
               <w:rPr>
-                <w:ins w:id="303" w:author="Microsoft Office User" w:date="2026-10-15T11:38:00Z"/>
+                <w:ins w:id="305" w:author="Microsoft Office User" w:date="2026-10-15T11:38:00Z"/>
                 <w:i/>
                 <w:iCs/>
                 <w:color w:val="545454"/>
@@ -10023,7 +10054,7 @@
                 <w:szCs w:val="20"/>
               </w:rPr>
             </w:pPr>
-            <w:ins w:id="304" w:author="Microsoft Office User" w:date="2026-10-15T11:38:00Z">
+            <w:ins w:id="306" w:author="Microsoft Office User" w:date="2026-10-15T11:38:00Z">
               <w:r>
                 <w:t>Declare all AI tools used and cite them here. Briefly outline how you considered data protection, copyright, and ethical responsibilities when choosing what to input into any AI system. Unauthorised use is subject to CCT disciplinary procedures.</w:t>
               </w:r>
@@ -10037,12 +10068,12 @@
           <w:p>
             <w:pPr>
               <w:rPr>
-                <w:ins w:id="305" w:author="Microsoft Office User" w:date="2026-10-15T11:38:00Z"/>
+                <w:ins w:id="307" w:author="Microsoft Office User" w:date="2026-10-15T11:38:00Z"/>
                 <w:sz w:val="20"/>
                 <w:szCs w:val="20"/>
               </w:rPr>
             </w:pPr>
-            <w:ins w:id="306" w:author="Microsoft Office User" w:date="2026-10-15T11:38:00Z">
+            <w:ins w:id="308" w:author="Microsoft Office User" w:date="2026-10-15T11:38:00Z">
               <w:r>
                 <w:rPr>
                   <w:sz w:val="20"/>
@@ -10055,7 +10086,7 @@
           <w:p>
             <w:pPr>
               <w:rPr>
-                <w:ins w:id="307" w:author="Microsoft Office User" w:date="2026-10-15T11:38:00Z"/>
+                <w:ins w:id="309" w:author="Microsoft Office User" w:date="2026-10-15T11:38:00Z"/>
                 <w:sz w:val="20"/>
                 <w:szCs w:val="20"/>
               </w:rPr>
@@ -10064,7 +10095,7 @@
           <w:p>
             <w:pPr>
               <w:rPr>
-                <w:ins w:id="308" w:author="Microsoft Office User" w:date="2026-10-15T11:38:00Z"/>
+                <w:ins w:id="310" w:author="Microsoft Office User" w:date="2026-10-15T11:38:00Z"/>
                 <w:sz w:val="20"/>
                 <w:szCs w:val="20"/>
               </w:rPr>
@@ -10075,7 +10106,7 @@
               <w:pStyle w:val="ListParagraph"/>
               <w:ind w:left="403"/>
               <w:rPr>
-                <w:ins w:id="309" w:author="Microsoft Office User" w:date="2026-10-15T11:38:00Z"/>
+                <w:ins w:id="311" w:author="Microsoft Office User" w:date="2026-10-15T11:38:00Z"/>
                 <w:color w:val="545454"/>
                 <w:sz w:val="20"/>
                 <w:szCs w:val="20"/>
@@ -10090,13 +10121,13 @@
           <w:p>
             <w:pPr>
               <w:rPr>
-                <w:ins w:id="310" w:author="Microsoft Office User" w:date="2026-10-15T11:38:00Z"/>
+                <w:ins w:id="312" w:author="Microsoft Office User" w:date="2026-10-15T11:38:00Z"/>
                 <w:color w:val="000000" w:themeColor="text1"/>
                 <w:sz w:val="20"/>
                 <w:szCs w:val="20"/>
               </w:rPr>
             </w:pPr>
-            <w:ins w:id="311" w:author="Microsoft Office User" w:date="2026-10-15T11:52:00Z">
+            <w:ins w:id="313" w:author="Microsoft Office User" w:date="2026-10-15T11:52:00Z">
               <w:r>
                 <w:rPr>
                   <w:color w:val="000000" w:themeColor="text1"/>
@@ -10113,7 +10144,7 @@
     <w:p>
       <w:pPr>
         <w:rPr>
-          <w:ins w:id="312" w:author="Microsoft Office User" w:date="2026-10-15T11:38:00Z"/>
+          <w:ins w:id="314" w:author="Microsoft Office User" w:date="2026-10-15T11:38:00Z"/>
           <w:i/>
           <w:iCs/>
           <w:color w:val="545454"/>
@@ -10126,12 +10157,12 @@
     <w:p>
       <w:pPr>
         <w:rPr>
-          <w:ins w:id="313" w:author="Microsoft Office User" w:date="2026-10-15T11:44:00Z"/>
+          <w:ins w:id="315" w:author="Microsoft Office User" w:date="2026-10-15T11:44:00Z"/>
           <w:sz w:val="20"/>
           <w:szCs w:val="20"/>
         </w:rPr>
       </w:pPr>
-      <w:ins w:id="314" w:author="Microsoft Office User" w:date="2026-10-15T11:38:00Z">
+      <w:ins w:id="316" w:author="Microsoft Office User" w:date="2026-10-15T11:38:00Z">
         <w:r>
           <w:rPr>
             <w:sz w:val="20"/>
@@ -10199,7 +10230,7 @@
     <w:p>
       <w:pPr>
         <w:rPr>
-          <w:ins w:id="315" w:author="Microsoft Office User" w:date="2026-10-15T11:44:00Z"/>
+          <w:ins w:id="317" w:author="Microsoft Office User" w:date="2026-10-15T11:44:00Z"/>
           <w:sz w:val="20"/>
           <w:szCs w:val="20"/>
         </w:rPr>
@@ -10209,10 +10240,10 @@
       <w:pPr>
         <w:pStyle w:val="Heading1"/>
         <w:rPr>
-          <w:ins w:id="316" w:author="Microsoft Office User" w:date="2026-10-15T11:44:00Z"/>
-        </w:rPr>
-      </w:pPr>
-      <w:ins w:id="317" w:author="Microsoft Office User" w:date="2026-10-15T11:44:00Z">
+          <w:ins w:id="318" w:author="Microsoft Office User" w:date="2026-10-15T11:44:00Z"/>
+        </w:rPr>
+      </w:pPr>
+      <w:ins w:id="319" w:author="Microsoft Office User" w:date="2026-10-15T11:44:00Z">
         <w:r>
           <w:t>Appendix</w:t>
         </w:r>
@@ -10221,17 +10252,17 @@
     <w:p>
       <w:pPr>
         <w:rPr>
-          <w:ins w:id="318" w:author="Microsoft Office User" w:date="2026-10-15T11:44:00Z"/>
-        </w:rPr>
-      </w:pPr>
-    </w:p>
-    <w:p>
-      <w:pPr>
-        <w:rPr>
-          <w:ins w:id="319" w:author="Microsoft Office User" w:date="2026-10-15T11:38:00Z"/>
-        </w:rPr>
-      </w:pPr>
-      <w:ins w:id="320" w:author="Microsoft Office User" w:date="2026-10-15T11:45:00Z">
+          <w:ins w:id="320" w:author="Microsoft Office User" w:date="2026-10-15T11:44:00Z"/>
+        </w:rPr>
+      </w:pPr>
+    </w:p>
+    <w:p>
+      <w:pPr>
+        <w:rPr>
+          <w:ins w:id="321" w:author="Microsoft Office User" w:date="2026-10-15T11:38:00Z"/>
+        </w:rPr>
+      </w:pPr>
+      <w:ins w:id="322" w:author="Microsoft Office User" w:date="2026-10-15T11:45:00Z">
         <w:r>
           <w:rPr>
             <w:noProof/>
@@ -10289,7 +10320,7 @@
       <w:pgNumType w:start="1"/>
       <w:cols w:space="720"/>
       <w:docGrid w:linePitch="0"/>
-      <w:sectPrChange w:id="321" w:author="Microsoft Office User" w:date="2026-10-15T11:26:00Z">
+      <w:sectPrChange w:id="323" w:author="Microsoft Office User" w:date="2026-10-15T11:26:00Z">
         <w:sectPr>
           <w:pgMar w:top="1440" w:right="1440" w:bottom="1440" w:left="1440" w:header="708" w:footer="708" w:gutter="0"/>
           <w:cols w:space="708"/>

</xml_diff>